<commit_message>
Final v3.1: deck, brief and walkthrough follow the old story; team names; clean deliverables
- Deck rebuilt to the 13 Oct flow (cover, anteater, three findings, click-through map, fell, 2019 parts,
  region, across the road, why/how it came back, reserve, six methods, causal claim, size test, limits, FZS)
  on net additions; lean charts on one zone (Tambopata buffer zone); team photo and names, no placeholders
- Brief: findings in the same order, lean figure, cold-reader fixes (one DiD baseline label, one causal range,
  stopping 25-47%, two corridors named, checks with units); Word export matches the PDF (2 pages)
- Walkthrough reordered to the talk; status chapter instead of to-dos; old brainstorm archived

Co-Authored-By: Claude Opus 5.5 (1M context) <noreply@anthropic.com>
</commit_message>
<xml_diff>
--- a/deliverables/GroupAnteater_Q2_brief.docx
+++ b/deliverables/GroupAnteater_Q2_brief.docx
@@ -18,7 +18,7 @@
         <w:rPr>
           <w:color w:val="4F5B60"/>
         </w:rPr>
-        <w:t xml:space="preserve">Group Giant Anteater · Data for Good · Question 2 · October 2026 · Team: [names]</w:t>
+        <w:t xml:space="preserve">Group Giant Anteater · Data for Good · Question 2 · October 2026 · Ruby Ann Grambauer, Sebastian Schmid, Laurens van der Lely, Omkar Mate, Dhruv Chaudhari</w:t>
       </w:r>
     </w:p>
     <w:p>
@@ -126,7 +126,7 @@
         <w:t xml:space="preserve">Comparison:</w:t>
       </w:r>
       <w:r>
-        <w:t xml:space="preserve"> the Amarakaeri buffer zone, only "less treated" (Mercurio II covered all of Madre de Dios; MINAM, 2021, p. 33), and 14 Peruvian buffer zones with mining. </w:t>
+        <w:t xml:space="preserve"> the Amarakaeri buffer zone, only "less treated" (Mercurio II covered all of Madre de Dios in 2019; MINAM, 2021, p. 33), and the 14 other Peruvian buffer zones with mining. </w:t>
       </w:r>
       <w:r>
         <w:rPr>
@@ -176,7 +176,7 @@
           <w:b/>
           <w:bCs/>
         </w:rPr>
-        <w:t xml:space="preserve">new</w:t>
+        <w:t xml:space="preserve">new land</w:t>
       </w:r>
       <w:r>
         <w:t xml:space="preserve">) + old mining land mined again (</w:t>
@@ -209,7 +209,17 @@
         <w:t xml:space="preserve">MapBiomas Peru, Collection 4</w:t>
       </w:r>
       <w:r>
-        <w:t xml:space="preserve"> (class 4.2: all mining, legal and illegal). Checks (ours vs publisher): Tambopata buffer zone 2025 20,730 vs 20,730 ha; reserve 777 vs 777; Madre de Dios 112,611 vs 112,622. </w:t>
+        <w:t xml:space="preserve"> (class 4.2: all mining, legal and illegal). </w:t>
+      </w:r>
+      <w:r>
+        <w:rPr>
+          <w:b/>
+          <w:bCs/>
+        </w:rPr>
+        <w:t xml:space="preserve">Checks, our number vs the publisher's:</w:t>
+      </w:r>
+      <w:r>
+        <w:t xml:space="preserve"> mining area (stock) 2025, Tambopata buffer zone 20,730 vs 20,730 ha; Tambopata reserve 777 vs 777 ha; Madre de Dios 112,611 vs 112,622 ha (0.01%: department boundary versions). </w:t>
       </w:r>
       <w:r>
         <w:rPr>
@@ -219,7 +229,7 @@
         <w:t xml:space="preserve">Context:</w:t>
       </w:r>
       <w:r>
-        <w:t xml:space="preserve"> World Bank gold price (Aug 2026 $4,411/oz vs 4,411); MINEM/BCRP gold (2019 7,103 vs 7,073 kg; an artisanal </w:t>
+        <w:t xml:space="preserve"> World Bank gold price, Aug 2026, $4,411 vs $4,411/oz; Madre de Dios gold output 2019 (MINEM files rebuilt vs central bank, BCRP) 7,103 vs 7,073 kg (0.4%; an artisanal </w:t>
       </w:r>
       <w:r>
         <w:rPr>
@@ -229,17 +239,17 @@
         <w:t xml:space="preserve">estimate</w:t>
       </w:r>
       <w:r>
-        <w:t xml:space="preserve"> until 2019); MEF spending, PP 0128 (2019 S/ 31,120,611 vs 31,120,611). </w:t>
-      </w:r>
-      <w:r>
-        <w:rPr>
-          <w:b/>
-          <w:bCs/>
-        </w:rPr>
-        <w:t xml:space="preserve">Cross-checks only (other measures):</w:t>
-      </w:r>
-      <w:r>
-        <w:t xml:space="preserve"> Amazon Mining Watch (no publisher totals; two clips 21,108 vs 21,127 ha), MapBiomas Amazonía Col. 6 (775,746 vs 780,000 ha, 2023), MapBiomas Brazil Col. 11 (39,915 vs 39,915 ha). Files: </w:t>
+        <w:t xml:space="preserve"> until 2019); Madre de Dios enforcement spending (MEF, programme PP 0128) 2019, S/ 31,120,611 vs 31,120,611. </w:t>
+      </w:r>
+      <w:r>
+        <w:rPr>
+          <w:b/>
+          <w:bCs/>
+        </w:rPr>
+        <w:t xml:space="preserve">Cross-checks only, other products:</w:t>
+      </w:r>
+      <w:r>
+        <w:t xml:space="preserve"> Amazon Mining Watch (AMW; no publisher totals: our zone cut agrees with a polygon cut, Tambopata buffer zone mining 2018 21,108 vs 21,127 ha); MapBiomas Amazonía Col. 6, mining area of the whole Amazon 2023, 775,746 vs 780,000 ha. Files: </w:t>
       </w:r>
       <w:r>
         <w:rPr>
@@ -250,7 +260,7 @@
         <w:t xml:space="preserve">DOWNLOAD_LOG.csv</w:t>
       </w:r>
       <w:r>
-        <w:t xml:space="preserve">; numbers and figure: </w:t>
+        <w:t xml:space="preserve">; every number and the figure: </w:t>
       </w:r>
       <w:r>
         <w:rPr>
@@ -280,9 +290,9 @@
       <w:r>
         <w:drawing>
           <wp:inline distT="0" distB="0" distL="0" distR="0">
-            <wp:extent cx="5334000" cy="4105275"/>
+            <wp:extent cx="4953000" cy="4038600"/>
             <wp:effectExtent t="0" r="0" b="0" l="0"/>
-            <wp:docPr id="1" name="Figure 1" descr="Net mining additions and their three parts: La Pampa sector and the corridor across the road (top); Madre de Dios by area (bottom)" title="Figure 1"/>
+            <wp:docPr id="1" name="Figure 1" descr="Net mining additions and their three parts, Tambopata buffer zone 2014–2025 (top); net additions by area, Madre de Dios, period means (bottom)" title="Figure 1"/>
             <wp:cNvGraphicFramePr>
               <a:graphicFrameLocks xmlns:a="http://schemas.openxmlformats.org/drawingml/2006/main" noChangeAspect="1"/>
             </wp:cNvGraphicFramePr>
@@ -305,7 +315,7 @@
                   <pic:spPr bwMode="auto">
                     <a:xfrm>
                       <a:off x="0" y="0"/>
-                      <a:ext cx="5334000" cy="4105275"/>
+                      <a:ext cx="4953000" cy="4038600"/>
                     </a:xfrm>
                     <a:prstGeom prst="rect">
                       <a:avLst/>
@@ -338,7 +348,7 @@
           <w:sz w:val="17"/>
           <w:szCs w:val="17"/>
         </w:rPr>
-        <w:t xml:space="preserve">Net mining additions and their three parts: La Pampa sector and the corridor across the road (top); Madre de Dios by area (bottom). Source: MapBiomas Peru, Collection 4.</w:t>
+        <w:t xml:space="preserve">Net mining additions and their three parts, Tambopata buffer zone 2014–2025 (top); net additions by area, Madre de Dios, period means (bottom). Source: MapBiomas Peru, Collection 4.</w:t>
       </w:r>
     </w:p>
     <w:p>
@@ -350,7 +360,7 @@
           <w:b/>
           <w:bCs/>
         </w:rPr>
-        <w:t xml:space="preserve">Net mining collapsed in the target during the operation</w:t>
+        <w:t xml:space="preserve">It fell: net mining in the target dropped 90%</w:t>
       </w:r>
       <w:r>
         <w:t xml:space="preserve"> </w:t>
@@ -359,11 +369,15 @@
         <w:rPr>
           <w:b/>
           <w:bCs/>
-        </w:rPr>
-        <w:t xml:space="preserve">[description]</w:t>
-      </w:r>
-      <w:r>
-        <w:t xml:space="preserve">. The Tambopata buffer zone fell from 1,640 to 163 ha/yr (2016–18 vs 2019–21) while the less-treated Amarakaeri rose from 289 to 574: a difference of </w:t>
+          <w:color w:val="FFFFFF"/>
+          <w:sz w:val="15"/>
+          <w:szCs w:val="15"/>
+          <w:shd w:fill="2B6A8A" w:color="auto" w:val="clear"/>
+        </w:rPr>
+        <w:t xml:space="preserve"> DESCRIPTION </w:t>
+      </w:r>
+      <w:r>
+        <w:t xml:space="preserve">. In the Tambopata buffer zone net additions fell from 1,640 ha/yr (2016–18) to 163 (2019–21), while the less-treated Amarakaeri buffer zone rose from 289 to 574: a difference in differences of </w:t>
       </w:r>
       <w:r>
         <w:rPr>
@@ -373,7 +387,7 @@
         <w:t xml:space="preserve">−1,762 ha/yr</w:t>
       </w:r>
       <w:r>
-        <w:t xml:space="preserve">. A fake start in 2016 gives +209; every 2019–21 year (≤ 417 ha) was below every 2011–18 year (≥ 707).</w:t>
+        <w:t xml:space="preserve"> (2016–18 base). With a fake start in 2016 (2013–15 vs 2016–18) it is +209. Every 2019–21 year (≤ 417 ha/yr) was below every 2011–18 year (≥ 707 ha/yr).</w:t>
       </w:r>
     </w:p>
     <w:p>
@@ -385,7 +399,7 @@
           <w:b/>
           <w:bCs/>
         </w:rPr>
-        <w:t xml:space="preserve">A quarter to a half of that fall is pits going out of use, mostly in 2019</w:t>
+        <w:t xml:space="preserve">In 2019, new pits kept opening while old ones went quiet</w:t>
       </w:r>
       <w:r>
         <w:t xml:space="preserve"> </w:t>
@@ -394,11 +408,15 @@
         <w:rPr>
           <w:b/>
           <w:bCs/>
-        </w:rPr>
-        <w:t xml:space="preserve">[description]</w:t>
-      </w:r>
-      <w:r>
-        <w:t xml:space="preserve">. New land fell from 2,017 to 1,061 ha/yr, while stopped land rose from 721 to 1,413. Stopping explains 25%–47% of the net fall, depending on whether we count land mined again within two years and stopping at the pre-2019 rate; 68% of the excess stopping came in 2019, when La Pampa lost 15% of its mining area from the mining class (2016–18: 7% a year). In Amarakaeri stopped land barely moved (542 → 584), so the stopping was specific to the target. In La Pampa new pits kept opening in 2019 (1,533 ha vs 1,835 in 2018) while 1,495 ha stopped; new land fell only in 2020–21, the COVID years. 50% of stopped land became water; 37% was mined again within two years (before 2019: 28%). Dethier et al. (2023), using mining ponds, independently report 70–90% abandonment in the targeted zones and faster mining just outside them.</w:t>
+          <w:color w:val="FFFFFF"/>
+          <w:sz w:val="15"/>
+          <w:szCs w:val="15"/>
+          <w:shd w:fill="2B6A8A" w:color="auto" w:val="clear"/>
+        </w:rPr>
+        <w:t xml:space="preserve"> DESCRIPTION </w:t>
+      </w:r>
+      <w:r>
+        <w:t xml:space="preserve">. New land in the Tambopata buffer zone was still 1,926 ha in 2019 (2018: 2,369), but 1,807 ha stopped, so net additions were only 417 ha. Over 2019–21, stopping explains a quarter to a half of the fall (25%–47%, depending on whether land mined again within two years counts), 68% of the extra stopping came in 2019, and the rest of the fall is fewer new pits, mainly in 2020–21 (COVID). In Amarakaeri stopped land stayed flat (542 → 584 ha/yr). In the Tambopata buffer zone half of the stopped land became water (50%) and 37% was mined again within two years (2016–18: 28%). With other indicators (mining ponds), Dethier et al. (2023) report 70–90% of activity abandoned in the targeted zones and faster mining just outside them.</w:t>
       </w:r>
     </w:p>
     <w:p>
@@ -410,7 +428,7 @@
           <w:b/>
           <w:bCs/>
         </w:rPr>
-        <w:t xml:space="preserve">Mining moved across the road, and the department never fell</w:t>
+        <w:t xml:space="preserve">Where it went: mining rose next door, and the region never fell</w:t>
       </w:r>
       <w:r>
         <w:t xml:space="preserve"> </w:t>
@@ -419,11 +437,15 @@
         <w:rPr>
           <w:b/>
           <w:bCs/>
-        </w:rPr>
-        <w:t xml:space="preserve">[description]</w:t>
-      </w:r>
-      <w:r>
-        <w:t xml:space="preserve">. In the legal corridor across the highway net additions rose from 60 to 395 ha/yr; the corridor's share of the department's net additions rose from 42% to 80%. Madre de Dios went 3,610 → 4,639 → 12,047 ha/yr. Rises elsewhere add up to 1.8 times the target's fall: not all of it can be miners who moved.</w:t>
+          <w:color w:val="FFFFFF"/>
+          <w:sz w:val="15"/>
+          <w:szCs w:val="15"/>
+          <w:shd w:fill="2B6A8A" w:color="auto" w:val="clear"/>
+        </w:rPr>
+        <w:t xml:space="preserve"> DESCRIPTION </w:t>
+      </w:r>
+      <w:r>
+        <w:t xml:space="preserve">. In the corridor strip just across the highway (≤ 10 km north, opposite La Pampa) net additions rose from 60 to 395 ha/yr (2016–18 vs 2019–21). On all legal mining-corridor land (D.L. 1100) the share of the department's net additions rose from 42% to 80% (period sums). Madre de Dios went 3,610 → 4,639 → 12,047 ha/yr (2016–18 → 2019–21 → 2022–25).</w:t>
       </w:r>
     </w:p>
     <w:p>
@@ -435,7 +457,7 @@
           <w:b/>
           <w:bCs/>
         </w:rPr>
-        <w:t xml:space="preserve">Therefore</w:t>
+        <w:t xml:space="preserve">Why and how it came back: money faded, gold soared, old pits reopened</w:t>
       </w:r>
       <w:r>
         <w:t xml:space="preserve"> </w:t>
@@ -444,21 +466,62 @@
         <w:rPr>
           <w:b/>
           <w:bCs/>
-        </w:rPr>
-        <w:t xml:space="preserve">[causal]</w:t>
-      </w:r>
-      <w:r>
-        <w:t xml:space="preserve">, </w:t>
+          <w:color w:val="FFFFFF"/>
+          <w:sz w:val="15"/>
+          <w:szCs w:val="15"/>
+          <w:shd w:fill="2B6A8A" w:color="auto" w:val="clear"/>
+        </w:rPr>
+        <w:t xml:space="preserve"> DESCRIPTION </w:t>
+      </w:r>
+      <w:r>
+        <w:t xml:space="preserve">. Enforcement spending in Madre de Dios (PP 0128) peaked at S/ 31,120,611 in 2019 and fell to S/ 5,008,539 in 2025, while the gold price rose 2.7-fold (2018–25). In 2022–25 the Tambopata buffer zone averaged 1,829 ha/yr (1,251 without 2023, a spike only MapBiomas shows); a third to a half of the land added was re-mined (33%–46%, without/with 2023). Inside Tambopata National Reserve net additions were +241 ha in 2025; MAAP reports ~500 ha from late 2025 to Feb 2026, the year the navy left the river posts (Pacsi et al., 2026).</w:t>
+      </w:r>
+    </w:p>
+    <w:p>
+      <w:pPr>
+        <w:spacing w:after="100"/>
+      </w:pPr>
+      <w:r>
+        <w:rPr>
+          <w:b/>
+          <w:bCs/>
+        </w:rPr>
+        <w:t xml:space="preserve">What we can say about cause</w:t>
+      </w:r>
+      <w:r>
+        <w:t xml:space="preserve"> </w:t>
+      </w:r>
+      <w:r>
+        <w:rPr>
+          <w:b/>
+          <w:bCs/>
+          <w:color w:val="FFFFFF"/>
+          <w:sz w:val="15"/>
+          <w:szCs w:val="15"/>
+          <w:shd w:fill="A42C58" w:color="auto" w:val="clear"/>
+        </w:rPr>
+        <w:t xml:space="preserve"> CAUSAL </w:t>
+      </w:r>
+      <w:r>
+        <w:t xml:space="preserve">. </w:t>
       </w:r>
       <w:r>
         <w:rPr>
           <w:i/>
           <w:iCs/>
         </w:rPr>
-        <w:t xml:space="preserve">if the other Peruvian buffer zones show what the Tambopata buffer zone would otherwise have done</w:t>
-      </w:r>
-      <w:r>
-        <w:t xml:space="preserve">, Mercurio and the operations that followed lowered its net mining additions by about 1,453 to 1,663 ha/yr in 2019–21 (all 14 zones, or Amarakaeri alone, 2014–18 baseline). A quarter to a half of it is land stopping (in this model 759 of 1,453); the rest is less new clearing; the fall is large in hectares but ordinary relative to the zone's size (3th–6th of 7 by scaling; in hectares it also ranks first in 2014–16, before Mercurio). Read it as an upper bound (4b).</w:t>
+        <w:t xml:space="preserve">If the other Peruvian buffer zones show what the Tambopata buffer zone would otherwise have done</w:t>
+      </w:r>
+      <w:r>
+        <w:t xml:space="preserve">, Mercurio and the operations that followed lowered its net mining additions by about 1,453 to 1,663 ha/yr in 2019–21 (against all 14 other zones, or Amarakaeri alone, with a 2014–18 base). A quarter to a half of that is pits going quiet; the rest is fewer new pits. Six methods point down; two hold up in hectares; none passes all its own checks: the fall is the largest of 15 zones in hectares (as in 2014–16, before Mercurio: it is the biggest zone), but only 3rd to 6th of 7 relative to each zone's size. Read it as an upper bound (4b).</w:t>
+      </w:r>
+    </w:p>
+    <w:p>
+      <w:pPr>
+        <w:pStyle w:val="Heading1"/>
+      </w:pPr>
+      <w:r>
+        <w:t xml:space="preserve">4. What FZS can do with this</w:t>
       </w:r>
     </w:p>
     <w:p>
@@ -470,7 +533,7 @@
           <w:b/>
           <w:bCs/>
         </w:rPr>
-        <w:t xml:space="preserve">It came back, on old pits; then mining entered the reserve</w:t>
+        <w:t xml:space="preserve">(a) What FZS learns</w:t>
       </w:r>
       <w:r>
         <w:t xml:space="preserve"> </w:t>
@@ -479,44 +542,15 @@
         <w:rPr>
           <w:b/>
           <w:bCs/>
-        </w:rPr>
-        <w:t xml:space="preserve">[description]</w:t>
-      </w:r>
-      <w:r>
-        <w:t xml:space="preserve">. In 2022–25 the target averaged 1,829 ha/yr (1,251 without 2023, a spike only MapBiomas shows), 1,139 of it re-mined. Inside the reserve net additions were +241 ha in 2025; MAAP reports ~500 ha from late 2025 to Feb 2026, after the navy left the river posts (Pacsi et al., 2026).</w:t>
-      </w:r>
-    </w:p>
-    <w:p>
-      <w:pPr>
-        <w:pStyle w:val="Heading1"/>
-      </w:pPr>
-      <w:r>
-        <w:t xml:space="preserve">4. What FZS can do with this</w:t>
-      </w:r>
-    </w:p>
-    <w:p>
-      <w:pPr>
-        <w:spacing w:after="100"/>
-      </w:pPr>
-      <w:r>
-        <w:rPr>
-          <w:b/>
-          <w:bCs/>
-        </w:rPr>
-        <w:t xml:space="preserve">(a) What FZS learns</w:t>
-      </w:r>
-      <w:r>
-        <w:t xml:space="preserve"> </w:t>
-      </w:r>
-      <w:r>
-        <w:rPr>
-          <w:b/>
-          <w:bCs/>
-        </w:rPr>
-        <w:t xml:space="preserve">[prediction]</w:t>
-      </w:r>
-      <w:r>
-        <w:t xml:space="preserve">. From this one case: a sharp local fall while patrols are present, a quarter to a half of it pits being abandoned; new pits nearby and across the nearest legal boundary; a return within about three years, largely on old pits; no fall in the region. So: </w:t>
+          <w:color w:val="FFFFFF"/>
+          <w:sz w:val="15"/>
+          <w:szCs w:val="15"/>
+          <w:shd w:fill="8A5F00" w:color="auto" w:val="clear"/>
+        </w:rPr>
+        <w:t xml:space="preserve"> PREDICTION </w:t>
+      </w:r>
+      <w:r>
+        <w:t xml:space="preserve">. From this one case: a sharp local fall while the operation runs, a quarter to a half of it pits going quiet; mining rising next door and across the nearest legal boundary; a return within about three years, largely on old pits; no fall in the region. So: </w:t>
       </w:r>
       <w:r>
         <w:rPr>
@@ -526,17 +560,17 @@
         <w:t xml:space="preserve">fund presence, not one-off sweeps; watch a ring of a few kilometres around each operation with near-real-time forest-loss alerts</w:t>
       </w:r>
       <w:r>
-        <w:t xml:space="preserve"> (new pits opened in 2019 while patrolled pits stopped); </w:t>
-      </w:r>
-      <w:r>
-        <w:rPr>
-          <w:b/>
-          <w:bCs/>
-        </w:rPr>
-        <w:t xml:space="preserve">hold the reserve's first kilometre and the river posts</w:t>
-      </w:r>
-      <w:r>
-        <w:t xml:space="preserve"> (91% of first-time mining inside the reserve is within 1 km of its edge); and trace gold origin in the corridor (0% royalty for small producers, Ley 28258, Art. 5; 145 of 9,592 miners in formalization fully formalized, MINAM, 2021, pp. 55–56).</w:t>
+        <w:t xml:space="preserve"> (new pits kept opening in 2019); </w:t>
+      </w:r>
+      <w:r>
+        <w:rPr>
+          <w:b/>
+          <w:bCs/>
+        </w:rPr>
+        <w:t xml:space="preserve">guard the reserve's first kilometre and the river posts</w:t>
+      </w:r>
+      <w:r>
+        <w:t xml:space="preserve"> (91% of first-time mining inside the reserve along its buffer-zone border, 2000–25, lies within 1 km of the edge); and trace gold origin in the corridor (0% royalty for small producers, Ley 28258, Art. 5; nationally 9,592 miners in the formalization register but 145 fully formalized, MINAM, 2021, pp. 55–56).</w:t>
       </w:r>
     </w:p>
     <w:p>
@@ -561,7 +595,7 @@
         <w:t xml:space="preserve">Omitted variables:</w:t>
       </w:r>
       <w:r>
-        <w:t xml:space="preserve"> COVID-19, the gold price (×2.7 2018–25) and later waves overlap the post-period and need not hit all zones alike (probably overstates). </w:t>
+        <w:t xml:space="preserve"> COVID-19, the gold price (×2.7, 2018–25) and later operations overlap 2019–21 and need not hit all zones alike (probably overstates the fall). </w:t>
       </w:r>
       <w:r>
         <w:rPr>
@@ -581,7 +615,7 @@
         <w:t xml:space="preserve">Selection of units:</w:t>
       </w:r>
       <w:r>
-        <w:t xml:space="preserve"> one targeted zone, far larger than any comparison: standard errors are not informative (Conley &amp; Taber, 2011) and raw placebo ranks measure size; Amarakaeri received miners (overstates) but had its own operation (understates). </w:t>
+        <w:t xml:space="preserve"> one targeted zone, far larger than any comparison, so standard errors are not informative (Conley &amp; Taber, 2011) and ranks in hectares mostly measure size; Amarakaeri received miners (overstates) but had its own operation (understates). </w:t>
       </w:r>
       <w:r>
         <w:rPr>
@@ -591,7 +625,7 @@
         <w:t xml:space="preserve">Measurement error:</w:t>
       </w:r>
       <w:r>
-        <w:t xml:space="preserve"> net additions mix three processes; a quarter to a half of the fall is pits leaving the mining class, and part of "stopped" is temporary or classification flicker, so </w:t>
+        <w:t xml:space="preserve"> net additions mix three processes; part of "stopped" is temporary or map noise, so </w:t>
       </w:r>
       <w:r>
         <w:rPr>
@@ -618,7 +652,7 @@
           <w:b/>
           <w:bCs/>
         </w:rPr>
-        <w:t xml:space="preserve">Read the fall as an upper bound, the return as a lower bound.</w:t>
+        <w:t xml:space="preserve">Read the fall as an upper bound and the return as a lower bound.</w:t>
       </w:r>
     </w:p>
     <w:p>
@@ -633,7 +667,7 @@
         <w:t xml:space="preserve">(c) What would let us say more.</w:t>
       </w:r>
       <w:r>
-        <w:t xml:space="preserve"> Dated patrol and interdiction records from SERNANP or FZS (intensity, not a 0/1 flag: were the stopped pits the raided ones?); an image-checked sample of stopped pits; concession and REINFO maps for legality pixel by pixel; dredge counts and mercury sampling; more operations as cases.</w:t>
+        <w:t xml:space="preserve"> Dated patrol and interdiction records from SERNANP or FZS (were the stopped pits the raided ones?); an image-checked sample of stopped pits; concession and formalization-register (REINFO) maps to grade legality pixel by pixel; dredge counts and mercury sampling; more operations as cases.</w:t>
       </w:r>
     </w:p>
     <w:p>
@@ -690,7 +724,7 @@
       <w:r>
         <w:t xml:space="preserve">, 12, 094004. </w:t>
       </w:r>
-      <w:hyperlink w:history="1" r:id="rIdg5fzeqtoffhgn7pzhlcw7">
+      <w:hyperlink w:history="1" r:id="rIdchtd7gotoqoilgbvkqpgq">
         <w:r>
           <w:rPr>
             <w:rStyle w:val="Hyperlink"/>
@@ -724,7 +758,7 @@
       <w:r>
         <w:t xml:space="preserve">, 93(1), 113–125. </w:t>
       </w:r>
-      <w:hyperlink w:history="1" r:id="rIdk5u9yiredycj1kjhb-bxj">
+      <w:hyperlink w:history="1" r:id="rIdrjbotpbaub1lzzjz-ob7g">
         <w:r>
           <w:rPr>
             <w:rStyle w:val="Hyperlink"/>
@@ -758,7 +792,7 @@
       <w:r>
         <w:t xml:space="preserve">, 16(5), e12978. </w:t>
       </w:r>
-      <w:hyperlink w:history="1" r:id="rIde_hqvprp0vzt5ernl6qpz">
+      <w:hyperlink w:history="1" r:id="rIdwmo9kedt587jefwdpgsde">
         <w:r>
           <w:rPr>
             <w:rStyle w:val="Hyperlink"/>
@@ -782,7 +816,7 @@
       <w:r>
         <w:t xml:space="preserve">Earth Genome (2026). Amazon Mining Watch, mining detections, model 48px_v4.10b (updated 3 Oct 2026). </w:t>
       </w:r>
-      <w:hyperlink w:history="1" r:id="rIdplnas5pmpemutbx4uwvie">
+      <w:hyperlink w:history="1" r:id="rIdnu9gabomu9ztuwtjlytiu">
         <w:r>
           <w:rPr>
             <w:rStyle w:val="Hyperlink"/>
@@ -806,7 +840,7 @@
       <w:r>
         <w:t xml:space="preserve">Finer, M., &amp; Mamani, N. (2020, 1 Dec). Illegal gold mining down 78% in Peruvian Amazon, but still threatens key areas. MAAP #130, figures "La Pampa" and "Before and after". </w:t>
       </w:r>
-      <w:hyperlink w:history="1" r:id="rIdc816okayitrcxfjawci3a">
+      <w:hyperlink w:history="1" r:id="rIdkzvcdl7aipaululq02un8">
         <w:r>
           <w:rPr>
             <w:rStyle w:val="Hyperlink"/>
@@ -830,7 +864,7 @@
       <w:r>
         <w:t xml:space="preserve">Frankfurt Zoological Society (n.d.). Bahuaja-Sonene and Tambopata. </w:t>
       </w:r>
-      <w:hyperlink w:history="1" r:id="rIdacrspbcpt6y7dpoxhiarx">
+      <w:hyperlink w:history="1" r:id="rId6fkyharmtbyti2nsnaeke">
         <w:r>
           <w:rPr>
             <w:rStyle w:val="Hyperlink"/>
@@ -854,7 +888,7 @@
       <w:r>
         <w:t xml:space="preserve">MapBiomas Amazonía (2024). Colección 6.0 de mapas anuales de cobertura y uso del suelo en la Amazonía, 1985–2023; factsheet p. 3. </w:t>
       </w:r>
-      <w:hyperlink w:history="1" r:id="rIdu1az5yg2bvj-hwecnlwjb">
+      <w:hyperlink w:history="1" r:id="rIdhkkvgh0rvkjce-hc6bcpd">
         <w:r>
           <w:rPr>
             <w:rStyle w:val="Hyperlink"/>
@@ -878,7 +912,7 @@
       <w:r>
         <w:t xml:space="preserve">MapBiomas Brasil (2025). Collection 11 (mining) and Collection 10.1 (indigenous-territory statistics). </w:t>
       </w:r>
-      <w:hyperlink w:history="1" r:id="rIdoactwvy_vh2r7sqy9ylj_">
+      <w:hyperlink w:history="1" r:id="rIdjs7xvxbddqlgzcxxd-d9p">
         <w:r>
           <w:rPr>
             <w:rStyle w:val="Hyperlink"/>
@@ -902,7 +936,7 @@
       <w:r>
         <w:t xml:space="preserve">MapBiomas Peru (2025). Collection 4 of annual land cover maps of Peru: annual maps and buffer-zone, protected-area and department statistics. </w:t>
       </w:r>
-      <w:hyperlink w:history="1" r:id="rIdyvptlkfoya8h610rlsqz6">
+      <w:hyperlink w:history="1" r:id="rIdk0u2ea27ea6txqbjwgric">
         <w:r>
           <w:rPr>
             <w:rStyle w:val="Hyperlink"/>
@@ -926,7 +960,7 @@
       <w:r>
         <w:t xml:space="preserve">MEF (2026). Consulta Amigable, programa presupuestal 0128, Madre de Dios. </w:t>
       </w:r>
-      <w:hyperlink w:history="1" r:id="rId2ytrhiojbujbylqbqel_v">
+      <w:hyperlink w:history="1" r:id="rIdhrovqv9cyf87mkcxalxyj">
         <w:r>
           <w:rPr>
             <w:rStyle w:val="Hyperlink"/>
@@ -950,7 +984,7 @@
       <w:r>
         <w:t xml:space="preserve">MINAM (2021). Plan Restauración: Plan integral frente a la minería ilegal (Anexo, D.S. N° 017-2021-MINAM), pp. 33, 55–56. </w:t>
       </w:r>
-      <w:hyperlink w:history="1" r:id="rId3pkszqm8eb4r2glxla8e0">
+      <w:hyperlink w:history="1" r:id="rIdowk6-pg8aw5wml90gkcz3">
         <w:r>
           <w:rPr>
             <w:rStyle w:val="Hyperlink"/>
@@ -974,7 +1008,7 @@
       <w:r>
         <w:t xml:space="preserve">MINEM (2026). Estadísticas mineras: producción minera; and BCRP (2026), Madre de Dios gold production series. </w:t>
       </w:r>
-      <w:hyperlink w:history="1" r:id="rIdcyyia2fhoapfmq-6rnv4e">
+      <w:hyperlink w:history="1" r:id="rIdpfhffjhagda3yxtfdxugy">
         <w:r>
           <w:rPr>
             <w:rStyle w:val="Hyperlink"/>
@@ -985,7 +1019,7 @@
       <w:r>
         <w:t xml:space="preserve"> ; </w:t>
       </w:r>
-      <w:hyperlink w:history="1" r:id="rIdgxiczr2smsltoutjpcq_n">
+      <w:hyperlink w:history="1" r:id="rId9gzvjjqpdkbovmfusiwxh">
         <w:r>
           <w:rPr>
             <w:rStyle w:val="Hyperlink"/>
@@ -1009,7 +1043,7 @@
       <w:r>
         <w:t xml:space="preserve">Pacsi, R., Novoa, S., La Torre, S., Balbuena, H., Finer, M., Santana, A., &amp; Castillo, H. (2026, 10 May). Rapid expansion of illegal gold mining in Tambopata National Reserve. MAAP #241, Image 1. </w:t>
       </w:r>
-      <w:hyperlink w:history="1" r:id="rIdjnymoosgaqaduqnttamam">
+      <w:hyperlink w:history="1" r:id="rIdw7nsrtpcsko-nsnsft5yc">
         <w:r>
           <w:rPr>
             <w:rStyle w:val="Hyperlink"/>
@@ -1033,7 +1067,7 @@
       <w:r>
         <w:t xml:space="preserve">Peru (2004). Ley N° 28258, Ley de Regalía Minera, Art. 5 and Art. 10. </w:t>
       </w:r>
-      <w:hyperlink w:history="1" r:id="rIdzvb8bktg-deieaduhhccz">
+      <w:hyperlink w:history="1" r:id="rIdvopjkltkkshubn8g4me91">
         <w:r>
           <w:rPr>
             <w:rStyle w:val="Hyperlink"/>
@@ -1057,7 +1091,7 @@
       <w:r>
         <w:t xml:space="preserve">University of Maryland GLAD (2026). GLAD-L Landsat forest-loss alerts, 2017–2026. </w:t>
       </w:r>
-      <w:hyperlink w:history="1" r:id="rId1mj0il8i0bvpb0ky9xdto">
+      <w:hyperlink w:history="1" r:id="rIdqzwgqmovajwhdry86hxrh">
         <w:r>
           <w:rPr>
             <w:rStyle w:val="Hyperlink"/>
@@ -1081,7 +1115,7 @@
       <w:r>
         <w:t xml:space="preserve">World Bank (2026). Commodity price data (Pink Sheet), monthly, gold. </w:t>
       </w:r>
-      <w:hyperlink w:history="1" r:id="rIdoflbgmuwsejqjnnrobzqq">
+      <w:hyperlink w:history="1" r:id="rIdytf4k6xjbauk1qoifsa5q">
         <w:r>
           <w:rPr>
             <w:rStyle w:val="Hyperlink"/>
@@ -1105,7 +1139,7 @@
       <w:r>
         <w:t xml:space="preserve">Yupanqui, O., Quispe, M., Novoa, S., Castañeda, C., Escalante, E., Finer, M., &amp; Mamani, N. (2023, 28 Sep). El retorno de minería ilegal en La Pampa. MAAP #193, dredge counts. </w:t>
       </w:r>
-      <w:hyperlink w:history="1" r:id="rIdewxbe3j7hve3dbd7oe3mp">
+      <w:hyperlink w:history="1" r:id="rIddjqbugwf8dpstgigzbplm">
         <w:r>
           <w:rPr>
             <w:rStyle w:val="Hyperlink"/>
@@ -1206,7 +1240,7 @@
         <w:t xml:space="preserve">Tool:</w:t>
       </w:r>
       <w:r>
-        <w:t xml:space="preserve"> Claude Code CLI 2.1.300 (Anthropic), non-interactive, no tools, run outside our project folder (no access to our files), 2026-10-15. </w:t>
+        <w:t xml:space="preserve"> Claude Code CLI 2.1.300 (Anthropic), non-interactive, no tools, run outside our project folder (no access to our files), 2026-10-15. The prompt quotes −1,761 ha/yr, our value before a later 0.07% pixel-area correction; the brief uses the corrected −1,762. </w:t>
       </w:r>
       <w:r>
         <w:rPr>
@@ -1278,7 +1312,7 @@
         <w:t xml:space="preserve">Added from our own tests:</w:t>
       </w:r>
       <w:r>
-        <w:t xml:space="preserve"> the size of each part (half the fall is stopping), the flicker share, the direction of each bias, and the fake-start check.</w:t>
+        <w:t xml:space="preserve"> the size of each part (stopping explains a quarter to a half of the fall), the flicker share, the direction of each bias, and the fake-start check.</w:t>
       </w:r>
     </w:p>
     <w:p>
@@ -3248,13 +3282,13 @@
       <w:rPr>
         <w:rFonts w:ascii="Calibri" w:cs="Calibri" w:eastAsia="Calibri" w:hAnsi="Calibri"/>
         <w:color w:val="1F2D33"/>
-        <w:sz w:val="20"/>
-        <w:szCs w:val="20"/>
+        <w:sz w:val="19"/>
+        <w:szCs w:val="19"/>
       </w:rPr>
     </w:rPrDefault>
     <w:pPrDefault>
       <w:pPr>
-        <w:spacing w:line="264"/>
+        <w:spacing w:line="252"/>
       </w:pPr>
     </w:pPrDefault>
   </w:docDefaults>

</xml_diff>

<commit_message>
Brief: grammar pass, checks as a table, definitions/methods/online appendices; deck: new cover title and La Pampa photo (CC BY-SA), FZS logo, definition slide in the main flow, road-bands slide; offline HTML pages in deliverables
Co-Authored-By: Claude Opus 5.5 (1M context) <noreply@anthropic.com>
</commit_message>
<xml_diff>
--- a/deliverables/GroupAnteater_Q2_brief.docx
+++ b/deliverables/GroupAnteater_Q2_brief.docx
@@ -41,7 +41,7 @@
         <w:t xml:space="preserve">FZS pays for enforcement and needs to know what it buys.</w:t>
       </w:r>
       <w:r>
-        <w:t xml:space="preserve"> It supports SERNANP's operations against alluvial gold mining around Tambopata and Bahuaja-Sonene (FZS, n.d.). Operations are costly and temporary, so: </w:t>
+        <w:t xml:space="preserve"> It supports SERNANP's operations against alluvial gold mining around Tambopata and Bahuaja-Sonene (FZS, n.d.). Operations are costly and temporary, so the question is: </w:t>
       </w:r>
       <w:r>
         <w:rPr>
@@ -61,7 +61,7 @@
         <w:t xml:space="preserve">deterrence</w:t>
       </w:r>
       <w:r>
-        <w:t xml:space="preserve">), move (</w:t>
+        <w:t xml:space="preserve">), move elsewhere (</w:t>
       </w:r>
       <w:r>
         <w:rPr>
@@ -71,7 +71,7 @@
         <w:t xml:space="preserve">displacement</w:t>
       </w:r>
       <w:r>
-        <w:t xml:space="preserve">) or return (</w:t>
+        <w:t xml:space="preserve">) or return later (</w:t>
       </w:r>
       <w:r>
         <w:rPr>
@@ -81,7 +81,7 @@
         <w:t xml:space="preserve">delay</w:t>
       </w:r>
       <w:r>
-        <w:t xml:space="preserve">); inside the target these look alike, so we need comparisons.</w:t>
+        <w:t xml:space="preserve">). Inside the target these three look alike, so we need comparison areas.</w:t>
       </w:r>
     </w:p>
     <w:p>
@@ -106,7 +106,7 @@
         <w:t xml:space="preserve">Treatment:</w:t>
       </w:r>
       <w:r>
-        <w:t xml:space="preserve"> its start in February 2019 (first treated year 2019); COVID-19 (2020), Plan Restauración (2021) and the April 2023 state of emergency are context, so we measure "Mercurio and what followed". </w:t>
+        <w:t xml:space="preserve"> the start of the operation in February 2019 (first treated year: 2019). COVID-19 (2020), Plan Restauración (2021) and the April 2023 state of emergency are context, so we measure "Mercurio and what followed". </w:t>
       </w:r>
       <w:r>
         <w:rPr>
@@ -116,7 +116,7 @@
         <w:t xml:space="preserve">Target:</w:t>
       </w:r>
       <w:r>
-        <w:t xml:space="preserve"> the Tambopata buffer zone (official boundary) and its La Pampa sector (70.15–69.80 W). </w:t>
+        <w:t xml:space="preserve"> the Tambopata buffer zone (official boundary) and its La Pampa sector (70.15–69.80° W). </w:t>
       </w:r>
       <w:r>
         <w:rPr>
@@ -126,17 +126,17 @@
         <w:t xml:space="preserve">Comparison:</w:t>
       </w:r>
       <w:r>
-        <w:t xml:space="preserve"> the Amarakaeri buffer zone, only "less treated" (Mercurio II covered all of Madre de Dios in 2019; MINAM, 2021, p. 33), and the 14 other Peruvian buffer zones with mining. </w:t>
-      </w:r>
-      <w:r>
-        <w:rPr>
-          <w:b/>
-          <w:bCs/>
-        </w:rPr>
-        <w:t xml:space="preserve">Around it:</w:t>
-      </w:r>
-      <w:r>
-        <w:t xml:space="preserve"> the legal corridor across the highway, the reserve, the department. </w:t>
+        <w:t xml:space="preserve"> the 14 other Peruvian buffer zones with mining, above all the Amarakaeri buffer zone, which was only "less treated" (Mercurio II covered all of Madre de Dios in 2019; MINAM, 2021, p. 33). </w:t>
+      </w:r>
+      <w:r>
+        <w:rPr>
+          <w:b/>
+          <w:bCs/>
+        </w:rPr>
+        <w:t xml:space="preserve">Around the target:</w:t>
+      </w:r>
+      <w:r>
+        <w:t xml:space="preserve"> the legal mining corridor across the highway, the reserve and the department. </w:t>
       </w:r>
       <w:r>
         <w:rPr>
@@ -146,7 +146,7 @@
         <w:t xml:space="preserve">Periods:</w:t>
       </w:r>
       <w:r>
-        <w:t xml:space="preserve"> 2016–18, 2019–21, 2022–25 ("later years").</w:t>
+        <w:t xml:space="preserve"> 2016–18, 2019–21 and 2022–25 ("later years").</w:t>
       </w:r>
     </w:p>
     <w:p>
@@ -166,7 +166,7 @@
           <w:b/>
           <w:bCs/>
         </w:rPr>
-        <w:t xml:space="preserve">One outcome everywhere: net mining additions</w:t>
+        <w:t xml:space="preserve">One outcome throughout: net mining additions</w:t>
       </w:r>
       <w:r>
         <w:t xml:space="preserve"> (ha/yr) = land mined for the first time (</w:t>
@@ -199,7 +199,7 @@
         <w:t xml:space="preserve">stopped</w:t>
       </w:r>
       <w:r>
-        <w:t xml:space="preserve">), counted pixel by pixel on the 30-m annual maps of </w:t>
+        <w:t xml:space="preserve">). We count it pixel by pixel on the 30-m annual maps of </w:t>
       </w:r>
       <w:r>
         <w:rPr>
@@ -209,47 +209,1008 @@
         <w:t xml:space="preserve">MapBiomas Peru, Collection 4</w:t>
       </w:r>
       <w:r>
-        <w:t xml:space="preserve"> (class 4.2: all mining, legal and illegal). </w:t>
-      </w:r>
-      <w:r>
-        <w:rPr>
-          <w:b/>
-          <w:bCs/>
-        </w:rPr>
-        <w:t xml:space="preserve">Checks, our number vs the publisher's:</w:t>
-      </w:r>
-      <w:r>
-        <w:t xml:space="preserve"> mining area (stock) 2025, Tambopata buffer zone 20,730 vs 20,730 ha; Tambopata reserve 777 vs 777 ha; Madre de Dios 112,611 vs 112,622 ha (0.01%: department boundary versions). </w:t>
-      </w:r>
-      <w:r>
-        <w:rPr>
-          <w:b/>
-          <w:bCs/>
-        </w:rPr>
-        <w:t xml:space="preserve">Context:</w:t>
-      </w:r>
-      <w:r>
-        <w:t xml:space="preserve"> World Bank gold price, Aug 2026, $4,411 vs $4,411/oz; Madre de Dios gold output 2019 (MINEM files rebuilt vs central bank, BCRP) 7,103 vs 7,073 kg (0.4%; an artisanal </w:t>
-      </w:r>
-      <w:r>
-        <w:rPr>
-          <w:i/>
-          <w:iCs/>
-        </w:rPr>
-        <w:t xml:space="preserve">estimate</w:t>
-      </w:r>
-      <w:r>
-        <w:t xml:space="preserve"> until 2019); Madre de Dios enforcement spending (MEF, programme PP 0128) 2019, S/ 31,120,611 vs 31,120,611. </w:t>
-      </w:r>
-      <w:r>
-        <w:rPr>
-          <w:b/>
-          <w:bCs/>
-        </w:rPr>
-        <w:t xml:space="preserve">Cross-checks only, other products:</w:t>
-      </w:r>
-      <w:r>
-        <w:t xml:space="preserve"> Amazon Mining Watch (AMW; no publisher totals: our zone cut agrees with a polygon cut, Tambopata buffer zone mining 2018 21,108 vs 21,127 ha); MapBiomas Amazonía Col. 6, mining area of the whole Amazon 2023, 775,746 vs 780,000 ha. Files: </w:t>
+        <w:t xml:space="preserve"> (class 4.2: all mining, legal and illegal); exact definitions are in Appendix A. One check per dataset, our number against the publisher's:</w:t>
+      </w:r>
+    </w:p>
+    <w:tbl>
+      <w:tblPr>
+        <w:tblW w:type="dxa" w:w="9636"/>
+        <w:tblBorders>
+          <w:top w:val="single" w:color="auto" w:sz="4"/>
+          <w:left w:val="single" w:color="auto" w:sz="4"/>
+          <w:bottom w:val="single" w:color="auto" w:sz="4"/>
+          <w:right w:val="single" w:color="auto" w:sz="4"/>
+          <w:insideH w:val="single" w:color="auto" w:sz="4"/>
+          <w:insideV w:val="single" w:color="auto" w:sz="4"/>
+        </w:tblBorders>
+      </w:tblPr>
+      <w:tblGrid>
+        <w:gridCol w:w="2409"/>
+        <w:gridCol w:w="2409"/>
+        <w:gridCol w:w="2409"/>
+        <w:gridCol w:w="2409"/>
+      </w:tblGrid>
+      <w:tr>
+        <w:trPr>
+          <w:tblHeader/>
+        </w:trPr>
+        <w:tc>
+          <w:tcPr>
+            <w:tcW w:type="dxa" w:w="2409"/>
+            <w:tcBorders>
+              <w:top w:val="single" w:color="C4C0B6" w:sz="4"/>
+              <w:left w:val="single" w:color="C4C0B6" w:sz="4"/>
+              <w:bottom w:val="single" w:color="C4C0B6" w:sz="4"/>
+              <w:right w:val="single" w:color="C4C0B6" w:sz="4"/>
+            </w:tcBorders>
+            <w:shd w:fill="E9E4DC" w:color="auto" w:val="clear"/>
+            <w:tcMar>
+              <w:top w:type="dxa" w:w="40"/>
+              <w:left w:type="dxa" w:w="80"/>
+              <w:bottom w:type="dxa" w:w="40"/>
+              <w:right w:type="dxa" w:w="80"/>
+            </w:tcMar>
+          </w:tcPr>
+          <w:p>
+            <w:r>
+              <w:rPr>
+                <w:b/>
+                <w:bCs/>
+                <w:sz w:val="17"/>
+                <w:szCs w:val="17"/>
+              </w:rPr>
+              <w:t xml:space="preserve">Dataset (publisher, version; used for)</w:t>
+            </w:r>
+          </w:p>
+        </w:tc>
+        <w:tc>
+          <w:tcPr>
+            <w:tcW w:type="dxa" w:w="2409"/>
+            <w:tcBorders>
+              <w:top w:val="single" w:color="C4C0B6" w:sz="4"/>
+              <w:left w:val="single" w:color="C4C0B6" w:sz="4"/>
+              <w:bottom w:val="single" w:color="C4C0B6" w:sz="4"/>
+              <w:right w:val="single" w:color="C4C0B6" w:sz="4"/>
+            </w:tcBorders>
+            <w:shd w:fill="E9E4DC" w:color="auto" w:val="clear"/>
+            <w:tcMar>
+              <w:top w:type="dxa" w:w="40"/>
+              <w:left w:type="dxa" w:w="80"/>
+              <w:bottom w:type="dxa" w:w="40"/>
+              <w:right w:type="dxa" w:w="80"/>
+            </w:tcMar>
+          </w:tcPr>
+          <w:p>
+            <w:r>
+              <w:rPr>
+                <w:b/>
+                <w:bCs/>
+                <w:sz w:val="17"/>
+                <w:szCs w:val="17"/>
+              </w:rPr>
+              <w:t xml:space="preserve">Check</w:t>
+            </w:r>
+          </w:p>
+        </w:tc>
+        <w:tc>
+          <w:tcPr>
+            <w:tcW w:type="dxa" w:w="2409"/>
+            <w:tcBorders>
+              <w:top w:val="single" w:color="C4C0B6" w:sz="4"/>
+              <w:left w:val="single" w:color="C4C0B6" w:sz="4"/>
+              <w:bottom w:val="single" w:color="C4C0B6" w:sz="4"/>
+              <w:right w:val="single" w:color="C4C0B6" w:sz="4"/>
+            </w:tcBorders>
+            <w:shd w:fill="E9E4DC" w:color="auto" w:val="clear"/>
+            <w:tcMar>
+              <w:top w:type="dxa" w:w="40"/>
+              <w:left w:type="dxa" w:w="80"/>
+              <w:bottom w:type="dxa" w:w="40"/>
+              <w:right w:type="dxa" w:w="80"/>
+            </w:tcMar>
+          </w:tcPr>
+          <w:p>
+            <w:r>
+              <w:rPr>
+                <w:b/>
+                <w:bCs/>
+                <w:sz w:val="17"/>
+                <w:szCs w:val="17"/>
+              </w:rPr>
+              <w:t xml:space="preserve">Ours</w:t>
+            </w:r>
+          </w:p>
+        </w:tc>
+        <w:tc>
+          <w:tcPr>
+            <w:tcW w:type="dxa" w:w="2409"/>
+            <w:tcBorders>
+              <w:top w:val="single" w:color="C4C0B6" w:sz="4"/>
+              <w:left w:val="single" w:color="C4C0B6" w:sz="4"/>
+              <w:bottom w:val="single" w:color="C4C0B6" w:sz="4"/>
+              <w:right w:val="single" w:color="C4C0B6" w:sz="4"/>
+            </w:tcBorders>
+            <w:shd w:fill="E9E4DC" w:color="auto" w:val="clear"/>
+            <w:tcMar>
+              <w:top w:type="dxa" w:w="40"/>
+              <w:left w:type="dxa" w:w="80"/>
+              <w:bottom w:type="dxa" w:w="40"/>
+              <w:right w:type="dxa" w:w="80"/>
+            </w:tcMar>
+          </w:tcPr>
+          <w:p>
+            <w:r>
+              <w:rPr>
+                <w:b/>
+                <w:bCs/>
+                <w:sz w:val="17"/>
+                <w:szCs w:val="17"/>
+              </w:rPr>
+              <w:t xml:space="preserve">Publisher</w:t>
+            </w:r>
+          </w:p>
+        </w:tc>
+      </w:tr>
+      <w:tr>
+        <w:tc>
+          <w:tcPr>
+            <w:tcW w:type="dxa" w:w="2409"/>
+            <w:tcBorders>
+              <w:top w:val="single" w:color="C4C0B6" w:sz="4"/>
+              <w:left w:val="single" w:color="C4C0B6" w:sz="4"/>
+              <w:bottom w:val="single" w:color="C4C0B6" w:sz="4"/>
+              <w:right w:val="single" w:color="C4C0B6" w:sz="4"/>
+            </w:tcBorders>
+            <w:tcMar>
+              <w:top w:type="dxa" w:w="40"/>
+              <w:left w:type="dxa" w:w="80"/>
+              <w:bottom w:type="dxa" w:w="40"/>
+              <w:right w:type="dxa" w:w="80"/>
+            </w:tcMar>
+          </w:tcPr>
+          <w:p>
+            <w:r>
+              <w:rPr>
+                <w:sz w:val="17"/>
+                <w:szCs w:val="17"/>
+              </w:rPr>
+              <w:t xml:space="preserve">MapBiomas Peru, Col. 4 annual maps (outcome)</w:t>
+            </w:r>
+          </w:p>
+        </w:tc>
+        <w:tc>
+          <w:tcPr>
+            <w:tcW w:type="dxa" w:w="2409"/>
+            <w:tcBorders>
+              <w:top w:val="single" w:color="C4C0B6" w:sz="4"/>
+              <w:left w:val="single" w:color="C4C0B6" w:sz="4"/>
+              <w:bottom w:val="single" w:color="C4C0B6" w:sz="4"/>
+              <w:right w:val="single" w:color="C4C0B6" w:sz="4"/>
+            </w:tcBorders>
+            <w:tcMar>
+              <w:top w:type="dxa" w:w="40"/>
+              <w:left w:type="dxa" w:w="80"/>
+              <w:bottom w:type="dxa" w:w="40"/>
+              <w:right w:type="dxa" w:w="80"/>
+            </w:tcMar>
+          </w:tcPr>
+          <w:p>
+            <w:r>
+              <w:rPr>
+                <w:sz w:val="17"/>
+                <w:szCs w:val="17"/>
+              </w:rPr>
+              <w:t xml:space="preserve">mining area 2025, Tambopata buffer zone</w:t>
+            </w:r>
+          </w:p>
+        </w:tc>
+        <w:tc>
+          <w:tcPr>
+            <w:tcW w:type="dxa" w:w="2409"/>
+            <w:tcBorders>
+              <w:top w:val="single" w:color="C4C0B6" w:sz="4"/>
+              <w:left w:val="single" w:color="C4C0B6" w:sz="4"/>
+              <w:bottom w:val="single" w:color="C4C0B6" w:sz="4"/>
+              <w:right w:val="single" w:color="C4C0B6" w:sz="4"/>
+            </w:tcBorders>
+            <w:tcMar>
+              <w:top w:type="dxa" w:w="40"/>
+              <w:left w:type="dxa" w:w="80"/>
+              <w:bottom w:type="dxa" w:w="40"/>
+              <w:right w:type="dxa" w:w="80"/>
+            </w:tcMar>
+          </w:tcPr>
+          <w:p>
+            <w:r>
+              <w:rPr>
+                <w:sz w:val="17"/>
+                <w:szCs w:val="17"/>
+              </w:rPr>
+              <w:t xml:space="preserve">20,730 ha</w:t>
+            </w:r>
+          </w:p>
+        </w:tc>
+        <w:tc>
+          <w:tcPr>
+            <w:tcW w:type="dxa" w:w="2409"/>
+            <w:tcBorders>
+              <w:top w:val="single" w:color="C4C0B6" w:sz="4"/>
+              <w:left w:val="single" w:color="C4C0B6" w:sz="4"/>
+              <w:bottom w:val="single" w:color="C4C0B6" w:sz="4"/>
+              <w:right w:val="single" w:color="C4C0B6" w:sz="4"/>
+            </w:tcBorders>
+            <w:tcMar>
+              <w:top w:type="dxa" w:w="40"/>
+              <w:left w:type="dxa" w:w="80"/>
+              <w:bottom w:type="dxa" w:w="40"/>
+              <w:right w:type="dxa" w:w="80"/>
+            </w:tcMar>
+          </w:tcPr>
+          <w:p>
+            <w:r>
+              <w:rPr>
+                <w:sz w:val="17"/>
+                <w:szCs w:val="17"/>
+              </w:rPr>
+              <w:t xml:space="preserve">20,730 ha</w:t>
+            </w:r>
+          </w:p>
+        </w:tc>
+      </w:tr>
+      <w:tr>
+        <w:tc>
+          <w:tcPr>
+            <w:tcW w:type="dxa" w:w="2409"/>
+            <w:tcBorders>
+              <w:top w:val="single" w:color="C4C0B6" w:sz="4"/>
+              <w:left w:val="single" w:color="C4C0B6" w:sz="4"/>
+              <w:bottom w:val="single" w:color="C4C0B6" w:sz="4"/>
+              <w:right w:val="single" w:color="C4C0B6" w:sz="4"/>
+            </w:tcBorders>
+            <w:tcMar>
+              <w:top w:type="dxa" w:w="40"/>
+              <w:left w:type="dxa" w:w="80"/>
+              <w:bottom w:type="dxa" w:w="40"/>
+              <w:right w:type="dxa" w:w="80"/>
+            </w:tcMar>
+          </w:tcPr>
+          <w:p/>
+        </w:tc>
+        <w:tc>
+          <w:tcPr>
+            <w:tcW w:type="dxa" w:w="2409"/>
+            <w:tcBorders>
+              <w:top w:val="single" w:color="C4C0B6" w:sz="4"/>
+              <w:left w:val="single" w:color="C4C0B6" w:sz="4"/>
+              <w:bottom w:val="single" w:color="C4C0B6" w:sz="4"/>
+              <w:right w:val="single" w:color="C4C0B6" w:sz="4"/>
+            </w:tcBorders>
+            <w:tcMar>
+              <w:top w:type="dxa" w:w="40"/>
+              <w:left w:type="dxa" w:w="80"/>
+              <w:bottom w:type="dxa" w:w="40"/>
+              <w:right w:type="dxa" w:w="80"/>
+            </w:tcMar>
+          </w:tcPr>
+          <w:p>
+            <w:r>
+              <w:rPr>
+                <w:sz w:val="17"/>
+                <w:szCs w:val="17"/>
+              </w:rPr>
+              <w:t xml:space="preserve">mining area 2025, Tambopata reserve</w:t>
+            </w:r>
+          </w:p>
+        </w:tc>
+        <w:tc>
+          <w:tcPr>
+            <w:tcW w:type="dxa" w:w="2409"/>
+            <w:tcBorders>
+              <w:top w:val="single" w:color="C4C0B6" w:sz="4"/>
+              <w:left w:val="single" w:color="C4C0B6" w:sz="4"/>
+              <w:bottom w:val="single" w:color="C4C0B6" w:sz="4"/>
+              <w:right w:val="single" w:color="C4C0B6" w:sz="4"/>
+            </w:tcBorders>
+            <w:tcMar>
+              <w:top w:type="dxa" w:w="40"/>
+              <w:left w:type="dxa" w:w="80"/>
+              <w:bottom w:type="dxa" w:w="40"/>
+              <w:right w:type="dxa" w:w="80"/>
+            </w:tcMar>
+          </w:tcPr>
+          <w:p>
+            <w:r>
+              <w:rPr>
+                <w:sz w:val="17"/>
+                <w:szCs w:val="17"/>
+              </w:rPr>
+              <w:t xml:space="preserve">777 ha</w:t>
+            </w:r>
+          </w:p>
+        </w:tc>
+        <w:tc>
+          <w:tcPr>
+            <w:tcW w:type="dxa" w:w="2409"/>
+            <w:tcBorders>
+              <w:top w:val="single" w:color="C4C0B6" w:sz="4"/>
+              <w:left w:val="single" w:color="C4C0B6" w:sz="4"/>
+              <w:bottom w:val="single" w:color="C4C0B6" w:sz="4"/>
+              <w:right w:val="single" w:color="C4C0B6" w:sz="4"/>
+            </w:tcBorders>
+            <w:tcMar>
+              <w:top w:type="dxa" w:w="40"/>
+              <w:left w:type="dxa" w:w="80"/>
+              <w:bottom w:type="dxa" w:w="40"/>
+              <w:right w:type="dxa" w:w="80"/>
+            </w:tcMar>
+          </w:tcPr>
+          <w:p>
+            <w:r>
+              <w:rPr>
+                <w:sz w:val="17"/>
+                <w:szCs w:val="17"/>
+              </w:rPr>
+              <w:t xml:space="preserve">777 ha</w:t>
+            </w:r>
+          </w:p>
+        </w:tc>
+      </w:tr>
+      <w:tr>
+        <w:tc>
+          <w:tcPr>
+            <w:tcW w:type="dxa" w:w="2409"/>
+            <w:tcBorders>
+              <w:top w:val="single" w:color="C4C0B6" w:sz="4"/>
+              <w:left w:val="single" w:color="C4C0B6" w:sz="4"/>
+              <w:bottom w:val="single" w:color="C4C0B6" w:sz="4"/>
+              <w:right w:val="single" w:color="C4C0B6" w:sz="4"/>
+            </w:tcBorders>
+            <w:tcMar>
+              <w:top w:type="dxa" w:w="40"/>
+              <w:left w:type="dxa" w:w="80"/>
+              <w:bottom w:type="dxa" w:w="40"/>
+              <w:right w:type="dxa" w:w="80"/>
+            </w:tcMar>
+          </w:tcPr>
+          <w:p/>
+        </w:tc>
+        <w:tc>
+          <w:tcPr>
+            <w:tcW w:type="dxa" w:w="2409"/>
+            <w:tcBorders>
+              <w:top w:val="single" w:color="C4C0B6" w:sz="4"/>
+              <w:left w:val="single" w:color="C4C0B6" w:sz="4"/>
+              <w:bottom w:val="single" w:color="C4C0B6" w:sz="4"/>
+              <w:right w:val="single" w:color="C4C0B6" w:sz="4"/>
+            </w:tcBorders>
+            <w:tcMar>
+              <w:top w:type="dxa" w:w="40"/>
+              <w:left w:type="dxa" w:w="80"/>
+              <w:bottom w:type="dxa" w:w="40"/>
+              <w:right w:type="dxa" w:w="80"/>
+            </w:tcMar>
+          </w:tcPr>
+          <w:p>
+            <w:r>
+              <w:rPr>
+                <w:sz w:val="17"/>
+                <w:szCs w:val="17"/>
+              </w:rPr>
+              <w:t xml:space="preserve">mining area 2025, Madre de Dios</w:t>
+            </w:r>
+          </w:p>
+        </w:tc>
+        <w:tc>
+          <w:tcPr>
+            <w:tcW w:type="dxa" w:w="2409"/>
+            <w:tcBorders>
+              <w:top w:val="single" w:color="C4C0B6" w:sz="4"/>
+              <w:left w:val="single" w:color="C4C0B6" w:sz="4"/>
+              <w:bottom w:val="single" w:color="C4C0B6" w:sz="4"/>
+              <w:right w:val="single" w:color="C4C0B6" w:sz="4"/>
+            </w:tcBorders>
+            <w:tcMar>
+              <w:top w:type="dxa" w:w="40"/>
+              <w:left w:type="dxa" w:w="80"/>
+              <w:bottom w:type="dxa" w:w="40"/>
+              <w:right w:type="dxa" w:w="80"/>
+            </w:tcMar>
+          </w:tcPr>
+          <w:p>
+            <w:r>
+              <w:rPr>
+                <w:sz w:val="17"/>
+                <w:szCs w:val="17"/>
+              </w:rPr>
+              <w:t xml:space="preserve">112,611 ha</w:t>
+            </w:r>
+          </w:p>
+        </w:tc>
+        <w:tc>
+          <w:tcPr>
+            <w:tcW w:type="dxa" w:w="2409"/>
+            <w:tcBorders>
+              <w:top w:val="single" w:color="C4C0B6" w:sz="4"/>
+              <w:left w:val="single" w:color="C4C0B6" w:sz="4"/>
+              <w:bottom w:val="single" w:color="C4C0B6" w:sz="4"/>
+              <w:right w:val="single" w:color="C4C0B6" w:sz="4"/>
+            </w:tcBorders>
+            <w:tcMar>
+              <w:top w:type="dxa" w:w="40"/>
+              <w:left w:type="dxa" w:w="80"/>
+              <w:bottom w:type="dxa" w:w="40"/>
+              <w:right w:type="dxa" w:w="80"/>
+            </w:tcMar>
+          </w:tcPr>
+          <w:p>
+            <w:r>
+              <w:rPr>
+                <w:sz w:val="17"/>
+                <w:szCs w:val="17"/>
+              </w:rPr>
+              <w:t xml:space="preserve">112,622 ha</w:t>
+            </w:r>
+          </w:p>
+        </w:tc>
+      </w:tr>
+      <w:tr>
+        <w:tc>
+          <w:tcPr>
+            <w:tcW w:type="dxa" w:w="2409"/>
+            <w:tcBorders>
+              <w:top w:val="single" w:color="C4C0B6" w:sz="4"/>
+              <w:left w:val="single" w:color="C4C0B6" w:sz="4"/>
+              <w:bottom w:val="single" w:color="C4C0B6" w:sz="4"/>
+              <w:right w:val="single" w:color="C4C0B6" w:sz="4"/>
+            </w:tcBorders>
+            <w:tcMar>
+              <w:top w:type="dxa" w:w="40"/>
+              <w:left w:type="dxa" w:w="80"/>
+              <w:bottom w:type="dxa" w:w="40"/>
+              <w:right w:type="dxa" w:w="80"/>
+            </w:tcMar>
+          </w:tcPr>
+          <w:p>
+            <w:r>
+              <w:rPr>
+                <w:sz w:val="17"/>
+                <w:szCs w:val="17"/>
+              </w:rPr>
+              <w:t xml:space="preserve">World Bank Pink Sheet (gold price)</w:t>
+            </w:r>
+          </w:p>
+        </w:tc>
+        <w:tc>
+          <w:tcPr>
+            <w:tcW w:type="dxa" w:w="2409"/>
+            <w:tcBorders>
+              <w:top w:val="single" w:color="C4C0B6" w:sz="4"/>
+              <w:left w:val="single" w:color="C4C0B6" w:sz="4"/>
+              <w:bottom w:val="single" w:color="C4C0B6" w:sz="4"/>
+              <w:right w:val="single" w:color="C4C0B6" w:sz="4"/>
+            </w:tcBorders>
+            <w:tcMar>
+              <w:top w:type="dxa" w:w="40"/>
+              <w:left w:type="dxa" w:w="80"/>
+              <w:bottom w:type="dxa" w:w="40"/>
+              <w:right w:type="dxa" w:w="80"/>
+            </w:tcMar>
+          </w:tcPr>
+          <w:p>
+            <w:r>
+              <w:rPr>
+                <w:sz w:val="17"/>
+                <w:szCs w:val="17"/>
+              </w:rPr>
+              <w:t xml:space="preserve">August 2026</w:t>
+            </w:r>
+          </w:p>
+        </w:tc>
+        <w:tc>
+          <w:tcPr>
+            <w:tcW w:type="dxa" w:w="2409"/>
+            <w:tcBorders>
+              <w:top w:val="single" w:color="C4C0B6" w:sz="4"/>
+              <w:left w:val="single" w:color="C4C0B6" w:sz="4"/>
+              <w:bottom w:val="single" w:color="C4C0B6" w:sz="4"/>
+              <w:right w:val="single" w:color="C4C0B6" w:sz="4"/>
+            </w:tcBorders>
+            <w:tcMar>
+              <w:top w:type="dxa" w:w="40"/>
+              <w:left w:type="dxa" w:w="80"/>
+              <w:bottom w:type="dxa" w:w="40"/>
+              <w:right w:type="dxa" w:w="80"/>
+            </w:tcMar>
+          </w:tcPr>
+          <w:p>
+            <w:r>
+              <w:rPr>
+                <w:sz w:val="17"/>
+                <w:szCs w:val="17"/>
+              </w:rPr>
+              <w:t xml:space="preserve">$4,411/oz</w:t>
+            </w:r>
+          </w:p>
+        </w:tc>
+        <w:tc>
+          <w:tcPr>
+            <w:tcW w:type="dxa" w:w="2409"/>
+            <w:tcBorders>
+              <w:top w:val="single" w:color="C4C0B6" w:sz="4"/>
+              <w:left w:val="single" w:color="C4C0B6" w:sz="4"/>
+              <w:bottom w:val="single" w:color="C4C0B6" w:sz="4"/>
+              <w:right w:val="single" w:color="C4C0B6" w:sz="4"/>
+            </w:tcBorders>
+            <w:tcMar>
+              <w:top w:type="dxa" w:w="40"/>
+              <w:left w:type="dxa" w:w="80"/>
+              <w:bottom w:type="dxa" w:w="40"/>
+              <w:right w:type="dxa" w:w="80"/>
+            </w:tcMar>
+          </w:tcPr>
+          <w:p>
+            <w:r>
+              <w:rPr>
+                <w:sz w:val="17"/>
+                <w:szCs w:val="17"/>
+              </w:rPr>
+              <w:t xml:space="preserve">$4,411/oz</w:t>
+            </w:r>
+          </w:p>
+        </w:tc>
+      </w:tr>
+      <w:tr>
+        <w:tc>
+          <w:tcPr>
+            <w:tcW w:type="dxa" w:w="2409"/>
+            <w:tcBorders>
+              <w:top w:val="single" w:color="C4C0B6" w:sz="4"/>
+              <w:left w:val="single" w:color="C4C0B6" w:sz="4"/>
+              <w:bottom w:val="single" w:color="C4C0B6" w:sz="4"/>
+              <w:right w:val="single" w:color="C4C0B6" w:sz="4"/>
+            </w:tcBorders>
+            <w:tcMar>
+              <w:top w:type="dxa" w:w="40"/>
+              <w:left w:type="dxa" w:w="80"/>
+              <w:bottom w:type="dxa" w:w="40"/>
+              <w:right w:type="dxa" w:w="80"/>
+            </w:tcMar>
+          </w:tcPr>
+          <w:p>
+            <w:r>
+              <w:rPr>
+                <w:sz w:val="17"/>
+                <w:szCs w:val="17"/>
+              </w:rPr>
+              <w:t xml:space="preserve">MINEM files vs central bank, BCRP (gold output, Madre de Dios)</w:t>
+            </w:r>
+          </w:p>
+        </w:tc>
+        <w:tc>
+          <w:tcPr>
+            <w:tcW w:type="dxa" w:w="2409"/>
+            <w:tcBorders>
+              <w:top w:val="single" w:color="C4C0B6" w:sz="4"/>
+              <w:left w:val="single" w:color="C4C0B6" w:sz="4"/>
+              <w:bottom w:val="single" w:color="C4C0B6" w:sz="4"/>
+              <w:right w:val="single" w:color="C4C0B6" w:sz="4"/>
+            </w:tcBorders>
+            <w:tcMar>
+              <w:top w:type="dxa" w:w="40"/>
+              <w:left w:type="dxa" w:w="80"/>
+              <w:bottom w:type="dxa" w:w="40"/>
+              <w:right w:type="dxa" w:w="80"/>
+            </w:tcMar>
+          </w:tcPr>
+          <w:p>
+            <w:r>
+              <w:rPr>
+                <w:sz w:val="17"/>
+                <w:szCs w:val="17"/>
+              </w:rPr>
+              <w:t xml:space="preserve">2019 (an artisanal </w:t>
+            </w:r>
+            <w:r>
+              <w:rPr>
+                <w:i/>
+                <w:iCs/>
+                <w:sz w:val="17"/>
+                <w:szCs w:val="17"/>
+              </w:rPr>
+              <w:t xml:space="preserve">estimate</w:t>
+            </w:r>
+            <w:r>
+              <w:rPr>
+                <w:sz w:val="17"/>
+                <w:szCs w:val="17"/>
+              </w:rPr>
+              <w:t xml:space="preserve"> until 2019)</w:t>
+            </w:r>
+          </w:p>
+        </w:tc>
+        <w:tc>
+          <w:tcPr>
+            <w:tcW w:type="dxa" w:w="2409"/>
+            <w:tcBorders>
+              <w:top w:val="single" w:color="C4C0B6" w:sz="4"/>
+              <w:left w:val="single" w:color="C4C0B6" w:sz="4"/>
+              <w:bottom w:val="single" w:color="C4C0B6" w:sz="4"/>
+              <w:right w:val="single" w:color="C4C0B6" w:sz="4"/>
+            </w:tcBorders>
+            <w:tcMar>
+              <w:top w:type="dxa" w:w="40"/>
+              <w:left w:type="dxa" w:w="80"/>
+              <w:bottom w:type="dxa" w:w="40"/>
+              <w:right w:type="dxa" w:w="80"/>
+            </w:tcMar>
+          </w:tcPr>
+          <w:p>
+            <w:r>
+              <w:rPr>
+                <w:sz w:val="17"/>
+                <w:szCs w:val="17"/>
+              </w:rPr>
+              <w:t xml:space="preserve">7,103 kg</w:t>
+            </w:r>
+          </w:p>
+        </w:tc>
+        <w:tc>
+          <w:tcPr>
+            <w:tcW w:type="dxa" w:w="2409"/>
+            <w:tcBorders>
+              <w:top w:val="single" w:color="C4C0B6" w:sz="4"/>
+              <w:left w:val="single" w:color="C4C0B6" w:sz="4"/>
+              <w:bottom w:val="single" w:color="C4C0B6" w:sz="4"/>
+              <w:right w:val="single" w:color="C4C0B6" w:sz="4"/>
+            </w:tcBorders>
+            <w:tcMar>
+              <w:top w:type="dxa" w:w="40"/>
+              <w:left w:type="dxa" w:w="80"/>
+              <w:bottom w:type="dxa" w:w="40"/>
+              <w:right w:type="dxa" w:w="80"/>
+            </w:tcMar>
+          </w:tcPr>
+          <w:p>
+            <w:r>
+              <w:rPr>
+                <w:sz w:val="17"/>
+                <w:szCs w:val="17"/>
+              </w:rPr>
+              <w:t xml:space="preserve">7,073 kg</w:t>
+            </w:r>
+          </w:p>
+        </w:tc>
+      </w:tr>
+      <w:tr>
+        <w:tc>
+          <w:tcPr>
+            <w:tcW w:type="dxa" w:w="2409"/>
+            <w:tcBorders>
+              <w:top w:val="single" w:color="C4C0B6" w:sz="4"/>
+              <w:left w:val="single" w:color="C4C0B6" w:sz="4"/>
+              <w:bottom w:val="single" w:color="C4C0B6" w:sz="4"/>
+              <w:right w:val="single" w:color="C4C0B6" w:sz="4"/>
+            </w:tcBorders>
+            <w:tcMar>
+              <w:top w:type="dxa" w:w="40"/>
+              <w:left w:type="dxa" w:w="80"/>
+              <w:bottom w:type="dxa" w:w="40"/>
+              <w:right w:type="dxa" w:w="80"/>
+            </w:tcMar>
+          </w:tcPr>
+          <w:p>
+            <w:r>
+              <w:rPr>
+                <w:sz w:val="17"/>
+                <w:szCs w:val="17"/>
+              </w:rPr>
+              <w:t xml:space="preserve">MEF programme PP 0128 (enforcement spending, Madre de Dios)</w:t>
+            </w:r>
+          </w:p>
+        </w:tc>
+        <w:tc>
+          <w:tcPr>
+            <w:tcW w:type="dxa" w:w="2409"/>
+            <w:tcBorders>
+              <w:top w:val="single" w:color="C4C0B6" w:sz="4"/>
+              <w:left w:val="single" w:color="C4C0B6" w:sz="4"/>
+              <w:bottom w:val="single" w:color="C4C0B6" w:sz="4"/>
+              <w:right w:val="single" w:color="C4C0B6" w:sz="4"/>
+            </w:tcBorders>
+            <w:tcMar>
+              <w:top w:type="dxa" w:w="40"/>
+              <w:left w:type="dxa" w:w="80"/>
+              <w:bottom w:type="dxa" w:w="40"/>
+              <w:right w:type="dxa" w:w="80"/>
+            </w:tcMar>
+          </w:tcPr>
+          <w:p>
+            <w:r>
+              <w:rPr>
+                <w:sz w:val="17"/>
+                <w:szCs w:val="17"/>
+              </w:rPr>
+              <w:t xml:space="preserve">2019</w:t>
+            </w:r>
+          </w:p>
+        </w:tc>
+        <w:tc>
+          <w:tcPr>
+            <w:tcW w:type="dxa" w:w="2409"/>
+            <w:tcBorders>
+              <w:top w:val="single" w:color="C4C0B6" w:sz="4"/>
+              <w:left w:val="single" w:color="C4C0B6" w:sz="4"/>
+              <w:bottom w:val="single" w:color="C4C0B6" w:sz="4"/>
+              <w:right w:val="single" w:color="C4C0B6" w:sz="4"/>
+            </w:tcBorders>
+            <w:tcMar>
+              <w:top w:type="dxa" w:w="40"/>
+              <w:left w:type="dxa" w:w="80"/>
+              <w:bottom w:type="dxa" w:w="40"/>
+              <w:right w:type="dxa" w:w="80"/>
+            </w:tcMar>
+          </w:tcPr>
+          <w:p>
+            <w:r>
+              <w:rPr>
+                <w:sz w:val="17"/>
+                <w:szCs w:val="17"/>
+              </w:rPr>
+              <w:t xml:space="preserve">S/ 31,120,611</w:t>
+            </w:r>
+          </w:p>
+        </w:tc>
+        <w:tc>
+          <w:tcPr>
+            <w:tcW w:type="dxa" w:w="2409"/>
+            <w:tcBorders>
+              <w:top w:val="single" w:color="C4C0B6" w:sz="4"/>
+              <w:left w:val="single" w:color="C4C0B6" w:sz="4"/>
+              <w:bottom w:val="single" w:color="C4C0B6" w:sz="4"/>
+              <w:right w:val="single" w:color="C4C0B6" w:sz="4"/>
+            </w:tcBorders>
+            <w:tcMar>
+              <w:top w:type="dxa" w:w="40"/>
+              <w:left w:type="dxa" w:w="80"/>
+              <w:bottom w:type="dxa" w:w="40"/>
+              <w:right w:type="dxa" w:w="80"/>
+            </w:tcMar>
+          </w:tcPr>
+          <w:p>
+            <w:r>
+              <w:rPr>
+                <w:sz w:val="17"/>
+                <w:szCs w:val="17"/>
+              </w:rPr>
+              <w:t xml:space="preserve">S/ 31,120,611</w:t>
+            </w:r>
+          </w:p>
+        </w:tc>
+      </w:tr>
+      <w:tr>
+        <w:tc>
+          <w:tcPr>
+            <w:tcW w:type="dxa" w:w="2409"/>
+            <w:tcBorders>
+              <w:top w:val="single" w:color="C4C0B6" w:sz="4"/>
+              <w:left w:val="single" w:color="C4C0B6" w:sz="4"/>
+              <w:bottom w:val="single" w:color="C4C0B6" w:sz="4"/>
+              <w:right w:val="single" w:color="C4C0B6" w:sz="4"/>
+            </w:tcBorders>
+            <w:tcMar>
+              <w:top w:type="dxa" w:w="40"/>
+              <w:left w:type="dxa" w:w="80"/>
+              <w:bottom w:type="dxa" w:w="40"/>
+              <w:right w:type="dxa" w:w="80"/>
+            </w:tcMar>
+          </w:tcPr>
+          <w:p>
+            <w:r>
+              <w:rPr>
+                <w:sz w:val="17"/>
+                <w:szCs w:val="17"/>
+              </w:rPr>
+              <w:t xml:space="preserve">Amazon Mining Watch, AMW (cross-check, twins)</w:t>
+            </w:r>
+          </w:p>
+        </w:tc>
+        <w:tc>
+          <w:tcPr>
+            <w:tcW w:type="dxa" w:w="2409"/>
+            <w:tcBorders>
+              <w:top w:val="single" w:color="C4C0B6" w:sz="4"/>
+              <w:left w:val="single" w:color="C4C0B6" w:sz="4"/>
+              <w:bottom w:val="single" w:color="C4C0B6" w:sz="4"/>
+              <w:right w:val="single" w:color="C4C0B6" w:sz="4"/>
+            </w:tcBorders>
+            <w:tcMar>
+              <w:top w:type="dxa" w:w="40"/>
+              <w:left w:type="dxa" w:w="80"/>
+              <w:bottom w:type="dxa" w:w="40"/>
+              <w:right w:type="dxa" w:w="80"/>
+            </w:tcMar>
+          </w:tcPr>
+          <w:p>
+            <w:r>
+              <w:rPr>
+                <w:sz w:val="17"/>
+                <w:szCs w:val="17"/>
+              </w:rPr>
+              <w:t xml:space="preserve">no published totals: Tambopata buffer zone 2018, our zone cut vs a polygon cut</w:t>
+            </w:r>
+          </w:p>
+        </w:tc>
+        <w:tc>
+          <w:tcPr>
+            <w:tcW w:type="dxa" w:w="2409"/>
+            <w:tcBorders>
+              <w:top w:val="single" w:color="C4C0B6" w:sz="4"/>
+              <w:left w:val="single" w:color="C4C0B6" w:sz="4"/>
+              <w:bottom w:val="single" w:color="C4C0B6" w:sz="4"/>
+              <w:right w:val="single" w:color="C4C0B6" w:sz="4"/>
+            </w:tcBorders>
+            <w:tcMar>
+              <w:top w:type="dxa" w:w="40"/>
+              <w:left w:type="dxa" w:w="80"/>
+              <w:bottom w:type="dxa" w:w="40"/>
+              <w:right w:type="dxa" w:w="80"/>
+            </w:tcMar>
+          </w:tcPr>
+          <w:p>
+            <w:r>
+              <w:rPr>
+                <w:sz w:val="17"/>
+                <w:szCs w:val="17"/>
+              </w:rPr>
+              <w:t xml:space="preserve">21,108 ha</w:t>
+            </w:r>
+          </w:p>
+        </w:tc>
+        <w:tc>
+          <w:tcPr>
+            <w:tcW w:type="dxa" w:w="2409"/>
+            <w:tcBorders>
+              <w:top w:val="single" w:color="C4C0B6" w:sz="4"/>
+              <w:left w:val="single" w:color="C4C0B6" w:sz="4"/>
+              <w:bottom w:val="single" w:color="C4C0B6" w:sz="4"/>
+              <w:right w:val="single" w:color="C4C0B6" w:sz="4"/>
+            </w:tcBorders>
+            <w:tcMar>
+              <w:top w:type="dxa" w:w="40"/>
+              <w:left w:type="dxa" w:w="80"/>
+              <w:bottom w:type="dxa" w:w="40"/>
+              <w:right w:type="dxa" w:w="80"/>
+            </w:tcMar>
+          </w:tcPr>
+          <w:p>
+            <w:r>
+              <w:rPr>
+                <w:sz w:val="17"/>
+                <w:szCs w:val="17"/>
+              </w:rPr>
+              <w:t xml:space="preserve">21,127 ha</w:t>
+            </w:r>
+          </w:p>
+        </w:tc>
+      </w:tr>
+      <w:tr>
+        <w:tc>
+          <w:tcPr>
+            <w:tcW w:type="dxa" w:w="2409"/>
+            <w:tcBorders>
+              <w:top w:val="single" w:color="C4C0B6" w:sz="4"/>
+              <w:left w:val="single" w:color="C4C0B6" w:sz="4"/>
+              <w:bottom w:val="single" w:color="C4C0B6" w:sz="4"/>
+              <w:right w:val="single" w:color="C4C0B6" w:sz="4"/>
+            </w:tcBorders>
+            <w:tcMar>
+              <w:top w:type="dxa" w:w="40"/>
+              <w:left w:type="dxa" w:w="80"/>
+              <w:bottom w:type="dxa" w:w="40"/>
+              <w:right w:type="dxa" w:w="80"/>
+            </w:tcMar>
+          </w:tcPr>
+          <w:p>
+            <w:r>
+              <w:rPr>
+                <w:sz w:val="17"/>
+                <w:szCs w:val="17"/>
+              </w:rPr>
+              <w:t xml:space="preserve">MapBiomas Amazonía, Col. 6 (twins)</w:t>
+            </w:r>
+          </w:p>
+        </w:tc>
+        <w:tc>
+          <w:tcPr>
+            <w:tcW w:type="dxa" w:w="2409"/>
+            <w:tcBorders>
+              <w:top w:val="single" w:color="C4C0B6" w:sz="4"/>
+              <w:left w:val="single" w:color="C4C0B6" w:sz="4"/>
+              <w:bottom w:val="single" w:color="C4C0B6" w:sz="4"/>
+              <w:right w:val="single" w:color="C4C0B6" w:sz="4"/>
+            </w:tcBorders>
+            <w:tcMar>
+              <w:top w:type="dxa" w:w="40"/>
+              <w:left w:type="dxa" w:w="80"/>
+              <w:bottom w:type="dxa" w:w="40"/>
+              <w:right w:type="dxa" w:w="80"/>
+            </w:tcMar>
+          </w:tcPr>
+          <w:p>
+            <w:r>
+              <w:rPr>
+                <w:sz w:val="17"/>
+                <w:szCs w:val="17"/>
+              </w:rPr>
+              <w:t xml:space="preserve">mining area, whole Amazon, 2023</w:t>
+            </w:r>
+          </w:p>
+        </w:tc>
+        <w:tc>
+          <w:tcPr>
+            <w:tcW w:type="dxa" w:w="2409"/>
+            <w:tcBorders>
+              <w:top w:val="single" w:color="C4C0B6" w:sz="4"/>
+              <w:left w:val="single" w:color="C4C0B6" w:sz="4"/>
+              <w:bottom w:val="single" w:color="C4C0B6" w:sz="4"/>
+              <w:right w:val="single" w:color="C4C0B6" w:sz="4"/>
+            </w:tcBorders>
+            <w:tcMar>
+              <w:top w:type="dxa" w:w="40"/>
+              <w:left w:type="dxa" w:w="80"/>
+              <w:bottom w:type="dxa" w:w="40"/>
+              <w:right w:type="dxa" w:w="80"/>
+            </w:tcMar>
+          </w:tcPr>
+          <w:p>
+            <w:r>
+              <w:rPr>
+                <w:sz w:val="17"/>
+                <w:szCs w:val="17"/>
+              </w:rPr>
+              <w:t xml:space="preserve">775,746 ha</w:t>
+            </w:r>
+          </w:p>
+        </w:tc>
+        <w:tc>
+          <w:tcPr>
+            <w:tcW w:type="dxa" w:w="2409"/>
+            <w:tcBorders>
+              <w:top w:val="single" w:color="C4C0B6" w:sz="4"/>
+              <w:left w:val="single" w:color="C4C0B6" w:sz="4"/>
+              <w:bottom w:val="single" w:color="C4C0B6" w:sz="4"/>
+              <w:right w:val="single" w:color="C4C0B6" w:sz="4"/>
+            </w:tcBorders>
+            <w:tcMar>
+              <w:top w:type="dxa" w:w="40"/>
+              <w:left w:type="dxa" w:w="80"/>
+              <w:bottom w:type="dxa" w:w="40"/>
+              <w:right w:type="dxa" w:w="80"/>
+            </w:tcMar>
+          </w:tcPr>
+          <w:p>
+            <w:r>
+              <w:rPr>
+                <w:sz w:val="17"/>
+                <w:szCs w:val="17"/>
+              </w:rPr>
+              <w:t xml:space="preserve">780,000 ha</w:t>
+            </w:r>
+          </w:p>
+        </w:tc>
+      </w:tr>
+    </w:tbl>
+    <w:p>
+      <w:pPr>
+        <w:spacing w:after="80"/>
+      </w:pPr>
+    </w:p>
+    <w:p>
+      <w:pPr>
+        <w:spacing w:after="100"/>
+      </w:pPr>
+      <w:r>
+        <w:t xml:space="preserve">Small gaps reflect boundary versions (Madre de Dios) and later revisions (BCRP). Files: </w:t>
       </w:r>
       <w:r>
         <w:rPr>
@@ -271,7 +1232,7 @@
         <w:t xml:space="preserve">code/main.py</w:t>
       </w:r>
       <w:r>
-        <w:t xml:space="preserve">.</w:t>
+        <w:t xml:space="preserve">; online walkthrough: Appendix D.</w:t>
       </w:r>
     </w:p>
     <w:p>
@@ -280,6 +1241,103 @@
       </w:pPr>
       <w:r>
         <w:t xml:space="preserve">3. Findings</w:t>
+      </w:r>
+    </w:p>
+    <w:p>
+      <w:pPr>
+        <w:spacing w:after="100"/>
+      </w:pPr>
+      <w:r>
+        <w:rPr>
+          <w:b/>
+          <w:bCs/>
+        </w:rPr>
+        <w:t xml:space="preserve">It fell: net mining in the target dropped 90%</w:t>
+      </w:r>
+      <w:r>
+        <w:t xml:space="preserve"> </w:t>
+      </w:r>
+      <w:r>
+        <w:rPr>
+          <w:b/>
+          <w:bCs/>
+          <w:color w:val="FFFFFF"/>
+          <w:sz w:val="15"/>
+          <w:szCs w:val="15"/>
+          <w:shd w:fill="2B6A8A" w:color="auto" w:val="clear"/>
+        </w:rPr>
+        <w:t xml:space="preserve"> DESCRIPTION </w:t>
+      </w:r>
+      <w:r>
+        <w:t xml:space="preserve">. In the Tambopata buffer zone, net additions fell from 1,640 ha/yr (2016–18) to 163 (2019–21), while in the less-treated Amarakaeri buffer zone they rose from 289 to 574: a difference-in-differences of </w:t>
+      </w:r>
+      <w:r>
+        <w:rPr>
+          <w:b/>
+          <w:bCs/>
+        </w:rPr>
+        <w:t xml:space="preserve">−1,762 ha/yr</w:t>
+      </w:r>
+      <w:r>
+        <w:t xml:space="preserve"> (2016–18 base). A fake start in 2016 (2013–15 vs 2016–18) gives +209. Every year in 2019–21 (at most 417 ha) was below every year in 2011–18 (at least 707 ha).</w:t>
+      </w:r>
+    </w:p>
+    <w:p>
+      <w:pPr>
+        <w:spacing w:after="100"/>
+      </w:pPr>
+      <w:r>
+        <w:rPr>
+          <w:b/>
+          <w:bCs/>
+        </w:rPr>
+        <w:t xml:space="preserve">In 2019, new pits kept opening while old ones went quiet</w:t>
+      </w:r>
+      <w:r>
+        <w:t xml:space="preserve"> </w:t>
+      </w:r>
+      <w:r>
+        <w:rPr>
+          <w:b/>
+          <w:bCs/>
+          <w:color w:val="FFFFFF"/>
+          <w:sz w:val="15"/>
+          <w:szCs w:val="15"/>
+          <w:shd w:fill="2B6A8A" w:color="auto" w:val="clear"/>
+        </w:rPr>
+        <w:t xml:space="preserve"> DESCRIPTION </w:t>
+      </w:r>
+      <w:r>
+        <w:t xml:space="preserve">. In 2019 the Tambopata buffer zone still gained 1,926 ha of new land (2018: 2,369 ha), but 1,807 ha stopped, so net additions were only 417 ha. Over 2019–21, stopping explains a quarter to a half of the fall (25%–47%, depending on whether land mined again within two years is counted), and 68% of the extra stopping came in 2019. The rest of the fall is fewer new pits, mainly in 2020–21 (COVID). In Amarakaeri, stopped land stayed flat (542 → 584 ha/yr). In the Tambopata buffer zone, half of the stopped land became water (50%), and 37% was mined again within two years (2016–18: 28%). Using other indicators (mining ponds), Dethier et al. (2023) report that 70–90% of activity was abandoned in the targeted zones and that mining sped up just outside them.</w:t>
+      </w:r>
+    </w:p>
+    <w:p>
+      <w:pPr>
+        <w:spacing w:after="100"/>
+      </w:pPr>
+      <w:r>
+        <w:rPr>
+          <w:b/>
+          <w:bCs/>
+        </w:rPr>
+        <w:t xml:space="preserve">Where it went: mining rose next door, and the region never fell</w:t>
+      </w:r>
+      <w:r>
+        <w:t xml:space="preserve"> </w:t>
+      </w:r>
+      <w:r>
+        <w:rPr>
+          <w:b/>
+          <w:bCs/>
+          <w:color w:val="FFFFFF"/>
+          <w:sz w:val="15"/>
+          <w:szCs w:val="15"/>
+          <w:shd w:fill="2B6A8A" w:color="auto" w:val="clear"/>
+        </w:rPr>
+        <w:t xml:space="preserve"> DESCRIPTION </w:t>
+      </w:r>
+      <w:r>
+        <w:t xml:space="preserve">. In the corridor strip just across the highway (up to 10 km north, opposite La Pampa), net additions rose from 60 to 395 ha/yr (2016–18 vs 2019–21). Across all legal mining-corridor land (D.L. 1100), the corridor's share of the department's net additions rose from 42% to 80% (period sums). Madre de Dios as a whole went from 3,610 to 4,639 to 12,047 ha/yr (2016–18, 2019–21, 2022–25).</w:t>
       </w:r>
     </w:p>
     <w:p>
@@ -290,7 +1348,7 @@
       <w:r>
         <w:drawing>
           <wp:inline distT="0" distB="0" distL="0" distR="0">
-            <wp:extent cx="4953000" cy="4038600"/>
+            <wp:extent cx="4953000" cy="3419475"/>
             <wp:effectExtent t="0" r="0" b="0" l="0"/>
             <wp:docPr id="1" name="Figure 1" descr="Net mining additions and their three parts, Tambopata buffer zone 2014–2025 (top); net additions by area, Madre de Dios, period means (bottom)" title="Figure 1"/>
             <wp:cNvGraphicFramePr>
@@ -315,7 +1373,7 @@
                   <pic:spPr bwMode="auto">
                     <a:xfrm>
                       <a:off x="0" y="0"/>
-                      <a:ext cx="4953000" cy="4038600"/>
+                      <a:ext cx="4953000" cy="3419475"/>
                     </a:xfrm>
                     <a:prstGeom prst="rect">
                       <a:avLst/>
@@ -360,7 +1418,7 @@
           <w:b/>
           <w:bCs/>
         </w:rPr>
-        <w:t xml:space="preserve">It fell: net mining in the target dropped 90%</w:t>
+        <w:t xml:space="preserve">Why and how it came back: money faded, gold soared, old pits reopened</w:t>
       </w:r>
       <w:r>
         <w:t xml:space="preserve"> </w:t>
@@ -377,104 +1435,7 @@
         <w:t xml:space="preserve"> DESCRIPTION </w:t>
       </w:r>
       <w:r>
-        <w:t xml:space="preserve">. In the Tambopata buffer zone net additions fell from 1,640 ha/yr (2016–18) to 163 (2019–21), while the less-treated Amarakaeri buffer zone rose from 289 to 574: a difference in differences of </w:t>
-      </w:r>
-      <w:r>
-        <w:rPr>
-          <w:b/>
-          <w:bCs/>
-        </w:rPr>
-        <w:t xml:space="preserve">−1,762 ha/yr</w:t>
-      </w:r>
-      <w:r>
-        <w:t xml:space="preserve"> (2016–18 base). With a fake start in 2016 (2013–15 vs 2016–18) it is +209. Every 2019–21 year (≤ 417 ha/yr) was below every 2011–18 year (≥ 707 ha/yr).</w:t>
-      </w:r>
-    </w:p>
-    <w:p>
-      <w:pPr>
-        <w:spacing w:after="100"/>
-      </w:pPr>
-      <w:r>
-        <w:rPr>
-          <w:b/>
-          <w:bCs/>
-        </w:rPr>
-        <w:t xml:space="preserve">In 2019, new pits kept opening while old ones went quiet</w:t>
-      </w:r>
-      <w:r>
-        <w:t xml:space="preserve"> </w:t>
-      </w:r>
-      <w:r>
-        <w:rPr>
-          <w:b/>
-          <w:bCs/>
-          <w:color w:val="FFFFFF"/>
-          <w:sz w:val="15"/>
-          <w:szCs w:val="15"/>
-          <w:shd w:fill="2B6A8A" w:color="auto" w:val="clear"/>
-        </w:rPr>
-        <w:t xml:space="preserve"> DESCRIPTION </w:t>
-      </w:r>
-      <w:r>
-        <w:t xml:space="preserve">. New land in the Tambopata buffer zone was still 1,926 ha in 2019 (2018: 2,369), but 1,807 ha stopped, so net additions were only 417 ha. Over 2019–21, stopping explains a quarter to a half of the fall (25%–47%, depending on whether land mined again within two years counts), 68% of the extra stopping came in 2019, and the rest of the fall is fewer new pits, mainly in 2020–21 (COVID). In Amarakaeri stopped land stayed flat (542 → 584 ha/yr). In the Tambopata buffer zone half of the stopped land became water (50%) and 37% was mined again within two years (2016–18: 28%). With other indicators (mining ponds), Dethier et al. (2023) report 70–90% of activity abandoned in the targeted zones and faster mining just outside them.</w:t>
-      </w:r>
-    </w:p>
-    <w:p>
-      <w:pPr>
-        <w:spacing w:after="100"/>
-      </w:pPr>
-      <w:r>
-        <w:rPr>
-          <w:b/>
-          <w:bCs/>
-        </w:rPr>
-        <w:t xml:space="preserve">Where it went: mining rose next door, and the region never fell</w:t>
-      </w:r>
-      <w:r>
-        <w:t xml:space="preserve"> </w:t>
-      </w:r>
-      <w:r>
-        <w:rPr>
-          <w:b/>
-          <w:bCs/>
-          <w:color w:val="FFFFFF"/>
-          <w:sz w:val="15"/>
-          <w:szCs w:val="15"/>
-          <w:shd w:fill="2B6A8A" w:color="auto" w:val="clear"/>
-        </w:rPr>
-        <w:t xml:space="preserve"> DESCRIPTION </w:t>
-      </w:r>
-      <w:r>
-        <w:t xml:space="preserve">. In the corridor strip just across the highway (≤ 10 km north, opposite La Pampa) net additions rose from 60 to 395 ha/yr (2016–18 vs 2019–21). On all legal mining-corridor land (D.L. 1100) the share of the department's net additions rose from 42% to 80% (period sums). Madre de Dios went 3,610 → 4,639 → 12,047 ha/yr (2016–18 → 2019–21 → 2022–25).</w:t>
-      </w:r>
-    </w:p>
-    <w:p>
-      <w:pPr>
-        <w:spacing w:after="100"/>
-      </w:pPr>
-      <w:r>
-        <w:rPr>
-          <w:b/>
-          <w:bCs/>
-        </w:rPr>
-        <w:t xml:space="preserve">Why and how it came back: money faded, gold soared, old pits reopened</w:t>
-      </w:r>
-      <w:r>
-        <w:t xml:space="preserve"> </w:t>
-      </w:r>
-      <w:r>
-        <w:rPr>
-          <w:b/>
-          <w:bCs/>
-          <w:color w:val="FFFFFF"/>
-          <w:sz w:val="15"/>
-          <w:szCs w:val="15"/>
-          <w:shd w:fill="2B6A8A" w:color="auto" w:val="clear"/>
-        </w:rPr>
-        <w:t xml:space="preserve"> DESCRIPTION </w:t>
-      </w:r>
-      <w:r>
-        <w:t xml:space="preserve">. Enforcement spending in Madre de Dios (PP 0128) peaked at S/ 31,120,611 in 2019 and fell to S/ 5,008,539 in 2025, while the gold price rose 2.7-fold (2018–25). In 2022–25 the Tambopata buffer zone averaged 1,829 ha/yr (1,251 without 2023, a spike only MapBiomas shows); a third to a half of the land added was re-mined (33%–46%, without/with 2023). Inside Tambopata National Reserve net additions were +241 ha in 2025; MAAP reports ~500 ha from late 2025 to Feb 2026, the year the navy left the river posts (Pacsi et al., 2026).</w:t>
+        <w:t xml:space="preserve">. Enforcement spending in Madre de Dios (PP 0128) peaked at S/ 31.1 million in 2019 and fell to S/ 5.0 million in 2025, while the gold price rose 2.7-fold (2018–25). In 2022–25 the Tambopata buffer zone averaged 1,829 ha/yr (1,251 without 2023, a spike that only MapBiomas shows), and a third to a half of the land added was re-mined (33%–46%, without/with 2023). Inside Tambopata National Reserve, net additions were +241 ha in 2025, the year the navy left the river posts; MAAP reports about 500 ha from late 2025 to February 2026 (Pacsi et al., 2026).</w:t>
       </w:r>
     </w:p>
     <w:p>
@@ -513,7 +1474,7 @@
         <w:t xml:space="preserve">If the other Peruvian buffer zones show what the Tambopata buffer zone would otherwise have done</w:t>
       </w:r>
       <w:r>
-        <w:t xml:space="preserve">, Mercurio and the operations that followed lowered its net mining additions by about 1,453 to 1,663 ha/yr in 2019–21 (against all 14 other zones, or Amarakaeri alone, with a 2014–18 base). A quarter to a half of that is pits going quiet; the rest is fewer new pits. Six methods point down; two hold up in hectares; none passes all its own checks: the fall is the largest of 15 zones in hectares (as in 2014–16, before Mercurio: it is the biggest zone), but only 3rd to 6th of 7 relative to each zone's size. Read it as an upper bound (4b).</w:t>
+        <w:t xml:space="preserve">, then Mercurio and the operations that followed lowered its net mining additions by about 1,453 to 1,663 ha/yr in 2019–21 (compared with all 14 other zones, or with Amarakaeri alone, using a 2014–18 base). A quarter to a half of this is pits going quiet; the rest is fewer new pits. All six methods we tried point down and two hold up in hectares, but none passes all of its own checks (Appendix C): the fall is the largest of the 15 zones in hectares, as it already was in 2014–16 because Tambopata is the largest mining zone, yet it ranks only 3rd to 6th of 7 relative to each zone's size. Read it as an upper bound (see 4b).</w:t>
       </w:r>
     </w:p>
     <w:p>
@@ -550,14 +1511,14 @@
         <w:t xml:space="preserve"> PREDICTION </w:t>
       </w:r>
       <w:r>
-        <w:t xml:space="preserve">. From this one case: a sharp local fall while the operation runs, a quarter to a half of it pits going quiet; mining rising next door and across the nearest legal boundary; a return within about three years, largely on old pits; no fall in the region. So: </w:t>
-      </w:r>
-      <w:r>
-        <w:rPr>
-          <w:b/>
-          <w:bCs/>
-        </w:rPr>
-        <w:t xml:space="preserve">fund presence, not one-off sweeps; watch a ring of a few kilometres around each operation with near-real-time forest-loss alerts</w:t>
+        <w:t xml:space="preserve">. From this one case, expect a sharp local fall while the operation runs, of which a quarter to a half is pits going quiet; mining rising next door and across the nearest legal boundary; a return within about three years, partly on old pits; and no fall in the region. FZS could therefore </w:t>
+      </w:r>
+      <w:r>
+        <w:rPr>
+          <w:b/>
+          <w:bCs/>
+        </w:rPr>
+        <w:t xml:space="preserve">fund a lasting presence rather than one-off sweeps; watch a ring of a few kilometres around each operation with near-real-time forest-loss alerts</w:t>
       </w:r>
       <w:r>
         <w:t xml:space="preserve"> (new pits kept opening in 2019); </w:t>
@@ -570,7 +1531,7 @@
         <w:t xml:space="preserve">guard the reserve's first kilometre and the river posts</w:t>
       </w:r>
       <w:r>
-        <w:t xml:space="preserve"> (91% of first-time mining inside the reserve along its buffer-zone border, 2000–25, lies within 1 km of the edge); and trace gold origin in the corridor (0% royalty for small producers, Ley 28258, Art. 5; nationally 9,592 miners in the formalization register but 145 fully formalized, MINAM, 2021, pp. 55–56).</w:t>
+        <w:t xml:space="preserve"> (91% of first-time mining inside the reserve along its buffer-zone border, 2000–25, lies within 1 km of the edge); and push for gold-origin tracing in the corridor (small producers pay a 0% royalty, Ley 28258, Art. 5; nationally, only 145 of the 9,592 miners in the formalization register were fully formalized; MINAM, 2021, pp. 55–56).</w:t>
       </w:r>
     </w:p>
     <w:p>
@@ -582,7 +1543,7 @@
           <w:b/>
           <w:bCs/>
         </w:rPr>
-        <w:t xml:space="preserve">(b) Why this could mislead, and which way.</w:t>
+        <w:t xml:space="preserve">(b) Why this could mislead, and in which direction.</w:t>
       </w:r>
       <w:r>
         <w:t xml:space="preserve"> </w:t>
@@ -595,7 +1556,7 @@
         <w:t xml:space="preserve">Omitted variables:</w:t>
       </w:r>
       <w:r>
-        <w:t xml:space="preserve"> COVID-19, the gold price (×2.7, 2018–25) and later operations overlap 2019–21 and need not hit all zones alike (probably overstates the fall). </w:t>
+        <w:t xml:space="preserve"> COVID-19, the gold price (×2.7, 2018–25) and later operations overlap 2019–21 and need not affect all zones alike (probably overstates the fall). </w:t>
       </w:r>
       <w:r>
         <w:rPr>
@@ -605,7 +1566,7 @@
         <w:t xml:space="preserve">Reverse causation:</w:t>
       </w:r>
       <w:r>
-        <w:t xml:space="preserve"> La Pampa was targeted at its peak; part of the fall is a return to normal (overstates). </w:t>
+        <w:t xml:space="preserve"> La Pampa was targeted at its peak, so part of the fall is a return to normal (overstates). </w:t>
       </w:r>
       <w:r>
         <w:rPr>
@@ -615,7 +1576,7 @@
         <w:t xml:space="preserve">Selection of units:</w:t>
       </w:r>
       <w:r>
-        <w:t xml:space="preserve"> one targeted zone, far larger than any comparison, so standard errors are not informative (Conley &amp; Taber, 2011) and ranks in hectares mostly measure size; Amarakaeri received miners (overstates) but had its own operation (understates). </w:t>
+        <w:t xml:space="preserve"> there is one targeted zone, far larger than any comparison, so standard errors are not informative (Conley &amp; Taber, 2011) and rankings in hectares mostly reflect size; Amarakaeri received miners (overstates) but had its own operation (understates). </w:t>
       </w:r>
       <w:r>
         <w:rPr>
@@ -625,7 +1586,7 @@
         <w:t xml:space="preserve">Measurement error:</w:t>
       </w:r>
       <w:r>
-        <w:t xml:space="preserve"> net additions mix three processes; part of "stopped" is temporary or map noise, so </w:t>
+        <w:t xml:space="preserve"> net additions mix three processes, and part of "stopped" is temporary or map noise, so </w:t>
       </w:r>
       <w:r>
         <w:rPr>
@@ -635,7 +1596,7 @@
         <w:t xml:space="preserve">net additions can fall while activity does not</w:t>
       </w:r>
       <w:r>
-        <w:t xml:space="preserve"> (overstates); hectares proxy for miners; the class mixes legal and illegal mining; </w:t>
+        <w:t xml:space="preserve"> (overstates); hectares are a proxy for miners; the mining class mixes legal and illegal mining; and </w:t>
       </w:r>
       <w:r>
         <w:rPr>
@@ -667,7 +1628,7 @@
         <w:t xml:space="preserve">(c) What would let us say more.</w:t>
       </w:r>
       <w:r>
-        <w:t xml:space="preserve"> Dated patrol and interdiction records from SERNANP or FZS (were the stopped pits the raided ones?); an image-checked sample of stopped pits; concession and formalization-register (REINFO) maps to grade legality pixel by pixel; dredge counts and mercury sampling; more operations as cases.</w:t>
+        <w:t xml:space="preserve"> Dated patrol and interdiction records from SERNANP or FZS (were the stopped pits the raided ones?); an image-checked sample of stopped pits; concession and formalization-register (REINFO) maps to grade legality pixel by pixel; dredge counts and mercury sampling; and more operations as cases.</w:t>
       </w:r>
     </w:p>
     <w:p>
@@ -724,7 +1685,7 @@
       <w:r>
         <w:t xml:space="preserve">, 12, 094004. </w:t>
       </w:r>
-      <w:hyperlink w:history="1" r:id="rIdchtd7gotoqoilgbvkqpgq">
+      <w:hyperlink w:history="1" r:id="rId5a-a5ol_swlipa8uq6mbg">
         <w:r>
           <w:rPr>
             <w:rStyle w:val="Hyperlink"/>
@@ -758,7 +1719,7 @@
       <w:r>
         <w:t xml:space="preserve">, 93(1), 113–125. </w:t>
       </w:r>
-      <w:hyperlink w:history="1" r:id="rIdrjbotpbaub1lzzjz-ob7g">
+      <w:hyperlink w:history="1" r:id="rIdnwl-ssznujrxfxhybcevt">
         <w:r>
           <w:rPr>
             <w:rStyle w:val="Hyperlink"/>
@@ -792,7 +1753,7 @@
       <w:r>
         <w:t xml:space="preserve">, 16(5), e12978. </w:t>
       </w:r>
-      <w:hyperlink w:history="1" r:id="rIdwmo9kedt587jefwdpgsde">
+      <w:hyperlink w:history="1" r:id="rIdfthncjfrmduzwk0toeoqd">
         <w:r>
           <w:rPr>
             <w:rStyle w:val="Hyperlink"/>
@@ -816,7 +1777,7 @@
       <w:r>
         <w:t xml:space="preserve">Earth Genome (2026). Amazon Mining Watch, mining detections, model 48px_v4.10b (updated 3 Oct 2026). </w:t>
       </w:r>
-      <w:hyperlink w:history="1" r:id="rIdnu9gabomu9ztuwtjlytiu">
+      <w:hyperlink w:history="1" r:id="rIddx7ffqxkb5cpfsxmko_-c">
         <w:r>
           <w:rPr>
             <w:rStyle w:val="Hyperlink"/>
@@ -840,7 +1801,7 @@
       <w:r>
         <w:t xml:space="preserve">Finer, M., &amp; Mamani, N. (2020, 1 Dec). Illegal gold mining down 78% in Peruvian Amazon, but still threatens key areas. MAAP #130, figures "La Pampa" and "Before and after". </w:t>
       </w:r>
-      <w:hyperlink w:history="1" r:id="rIdkzvcdl7aipaululq02un8">
+      <w:hyperlink w:history="1" r:id="rIddm8n0uardvveq2ipw-fui">
         <w:r>
           <w:rPr>
             <w:rStyle w:val="Hyperlink"/>
@@ -864,7 +1825,7 @@
       <w:r>
         <w:t xml:space="preserve">Frankfurt Zoological Society (n.d.). Bahuaja-Sonene and Tambopata. </w:t>
       </w:r>
-      <w:hyperlink w:history="1" r:id="rId6fkyharmtbyti2nsnaeke">
+      <w:hyperlink w:history="1" r:id="rIde25dchnfsxxmp6owybm4m">
         <w:r>
           <w:rPr>
             <w:rStyle w:val="Hyperlink"/>
@@ -888,7 +1849,7 @@
       <w:r>
         <w:t xml:space="preserve">MapBiomas Amazonía (2024). Colección 6.0 de mapas anuales de cobertura y uso del suelo en la Amazonía, 1985–2023; factsheet p. 3. </w:t>
       </w:r>
-      <w:hyperlink w:history="1" r:id="rIdhkkvgh0rvkjce-hc6bcpd">
+      <w:hyperlink w:history="1" r:id="rIdzyrxrnlyllgnthqr2dzuk">
         <w:r>
           <w:rPr>
             <w:rStyle w:val="Hyperlink"/>
@@ -912,7 +1873,7 @@
       <w:r>
         <w:t xml:space="preserve">MapBiomas Brasil (2025). Collection 11 (mining) and Collection 10.1 (indigenous-territory statistics). </w:t>
       </w:r>
-      <w:hyperlink w:history="1" r:id="rIdjs7xvxbddqlgzcxxd-d9p">
+      <w:hyperlink w:history="1" r:id="rIdbhzufwbdlahp9g8qqdy1g">
         <w:r>
           <w:rPr>
             <w:rStyle w:val="Hyperlink"/>
@@ -936,7 +1897,7 @@
       <w:r>
         <w:t xml:space="preserve">MapBiomas Peru (2025). Collection 4 of annual land cover maps of Peru: annual maps and buffer-zone, protected-area and department statistics. </w:t>
       </w:r>
-      <w:hyperlink w:history="1" r:id="rIdk0u2ea27ea6txqbjwgric">
+      <w:hyperlink w:history="1" r:id="rIdbi8_r1xvji_u6-bm3ohy4">
         <w:r>
           <w:rPr>
             <w:rStyle w:val="Hyperlink"/>
@@ -960,7 +1921,7 @@
       <w:r>
         <w:t xml:space="preserve">MEF (2026). Consulta Amigable, programa presupuestal 0128, Madre de Dios. </w:t>
       </w:r>
-      <w:hyperlink w:history="1" r:id="rIdhrovqv9cyf87mkcxalxyj">
+      <w:hyperlink w:history="1" r:id="rIdfrwgx99w3y8ezzcmx9o-h">
         <w:r>
           <w:rPr>
             <w:rStyle w:val="Hyperlink"/>
@@ -984,7 +1945,7 @@
       <w:r>
         <w:t xml:space="preserve">MINAM (2021). Plan Restauración: Plan integral frente a la minería ilegal (Anexo, D.S. N° 017-2021-MINAM), pp. 33, 55–56. </w:t>
       </w:r>
-      <w:hyperlink w:history="1" r:id="rIdowk6-pg8aw5wml90gkcz3">
+      <w:hyperlink w:history="1" r:id="rIdswtlpf7hjeudzxw9wjgya">
         <w:r>
           <w:rPr>
             <w:rStyle w:val="Hyperlink"/>
@@ -1008,7 +1969,7 @@
       <w:r>
         <w:t xml:space="preserve">MINEM (2026). Estadísticas mineras: producción minera; and BCRP (2026), Madre de Dios gold production series. </w:t>
       </w:r>
-      <w:hyperlink w:history="1" r:id="rIdpfhffjhagda3yxtfdxugy">
+      <w:hyperlink w:history="1" r:id="rIdjmt73reageyds765cq_br">
         <w:r>
           <w:rPr>
             <w:rStyle w:val="Hyperlink"/>
@@ -1019,7 +1980,7 @@
       <w:r>
         <w:t xml:space="preserve"> ; </w:t>
       </w:r>
-      <w:hyperlink w:history="1" r:id="rId9gzvjjqpdkbovmfusiwxh">
+      <w:hyperlink w:history="1" r:id="rIdtafbno7ihkmccsmvs4ip1">
         <w:r>
           <w:rPr>
             <w:rStyle w:val="Hyperlink"/>
@@ -1043,7 +2004,7 @@
       <w:r>
         <w:t xml:space="preserve">Pacsi, R., Novoa, S., La Torre, S., Balbuena, H., Finer, M., Santana, A., &amp; Castillo, H. (2026, 10 May). Rapid expansion of illegal gold mining in Tambopata National Reserve. MAAP #241, Image 1. </w:t>
       </w:r>
-      <w:hyperlink w:history="1" r:id="rIdw7nsrtpcsko-nsnsft5yc">
+      <w:hyperlink w:history="1" r:id="rId-3mlvt4px8co5zwt1af_p">
         <w:r>
           <w:rPr>
             <w:rStyle w:val="Hyperlink"/>
@@ -1067,7 +2028,7 @@
       <w:r>
         <w:t xml:space="preserve">Peru (2004). Ley N° 28258, Ley de Regalía Minera, Art. 5 and Art. 10. </w:t>
       </w:r>
-      <w:hyperlink w:history="1" r:id="rIdvopjkltkkshubn8g4me91">
+      <w:hyperlink w:history="1" r:id="rIdgplexefb0er4y6ywvli2i">
         <w:r>
           <w:rPr>
             <w:rStyle w:val="Hyperlink"/>
@@ -1091,7 +2052,7 @@
       <w:r>
         <w:t xml:space="preserve">University of Maryland GLAD (2026). GLAD-L Landsat forest-loss alerts, 2017–2026. </w:t>
       </w:r>
-      <w:hyperlink w:history="1" r:id="rIdqzwgqmovajwhdry86hxrh">
+      <w:hyperlink w:history="1" r:id="rIdugvwb6dx3q-t5d8akxymi">
         <w:r>
           <w:rPr>
             <w:rStyle w:val="Hyperlink"/>
@@ -1115,7 +2076,7 @@
       <w:r>
         <w:t xml:space="preserve">World Bank (2026). Commodity price data (Pink Sheet), monthly, gold. </w:t>
       </w:r>
-      <w:hyperlink w:history="1" r:id="rIdytf4k6xjbauk1qoifsa5q">
+      <w:hyperlink w:history="1" r:id="rIdfxftls_sehlmvs0eyb9od">
         <w:r>
           <w:rPr>
             <w:rStyle w:val="Hyperlink"/>
@@ -1139,7 +2100,7 @@
       <w:r>
         <w:t xml:space="preserve">Yupanqui, O., Quispe, M., Novoa, S., Castañeda, C., Escalante, E., Finer, M., &amp; Mamani, N. (2023, 28 Sep). El retorno de minería ilegal en La Pampa. MAAP #193, dredge counts. </w:t>
       </w:r>
-      <w:hyperlink w:history="1" r:id="rIddjqbugwf8dpstgigzbplm">
+      <w:hyperlink w:history="1" r:id="rIdzejswpdnvb2tm5uojgcd3">
         <w:r>
           <w:rPr>
             <w:rStyle w:val="Hyperlink"/>
@@ -1164,23 +2125,640 @@
         <w:pStyle w:val="Heading1"/>
       </w:pPr>
       <w:r>
-        <w:t xml:space="preserve">Appendix A. Data log and definitions</w:t>
+        <w:t xml:space="preserve">Appendix A. Definitions and data log</w:t>
       </w:r>
     </w:p>
     <w:p>
       <w:pPr>
         <w:spacing w:after="100"/>
       </w:pPr>
+      <w:r>
+        <w:rPr>
+          <w:b/>
+          <w:bCs/>
+        </w:rPr>
+        <w:t xml:space="preserve">Outcome.</w:t>
+      </w:r>
+      <w:r>
+        <w:t xml:space="preserve"> For every 30-m pixel and year </w:t>
+      </w:r>
+      <w:r>
+        <w:rPr>
+          <w:i/>
+          <w:iCs/>
+        </w:rPr>
+        <w:t xml:space="preserve">t</w:t>
+      </w:r>
+      <w:r>
+        <w:t xml:space="preserve"> on the MapBiomas Peru Collection 4 maps (class 30, "4.2 Minería"):</w:t>
+      </w:r>
+    </w:p>
+    <w:tbl>
+      <w:tblPr>
+        <w:tblW w:type="dxa" w:w="9636"/>
+        <w:tblBorders>
+          <w:top w:val="single" w:color="auto" w:sz="4"/>
+          <w:left w:val="single" w:color="auto" w:sz="4"/>
+          <w:bottom w:val="single" w:color="auto" w:sz="4"/>
+          <w:right w:val="single" w:color="auto" w:sz="4"/>
+          <w:insideH w:val="single" w:color="auto" w:sz="4"/>
+          <w:insideV w:val="single" w:color="auto" w:sz="4"/>
+        </w:tblBorders>
+      </w:tblPr>
+      <w:tblGrid>
+        <w:gridCol w:w="3212"/>
+        <w:gridCol w:w="3212"/>
+        <w:gridCol w:w="3212"/>
+      </w:tblGrid>
+      <w:tr>
+        <w:trPr>
+          <w:tblHeader/>
+        </w:trPr>
+        <w:tc>
+          <w:tcPr>
+            <w:tcW w:type="dxa" w:w="3212"/>
+            <w:tcBorders>
+              <w:top w:val="single" w:color="C4C0B6" w:sz="4"/>
+              <w:left w:val="single" w:color="C4C0B6" w:sz="4"/>
+              <w:bottom w:val="single" w:color="C4C0B6" w:sz="4"/>
+              <w:right w:val="single" w:color="C4C0B6" w:sz="4"/>
+            </w:tcBorders>
+            <w:shd w:fill="E9E4DC" w:color="auto" w:val="clear"/>
+            <w:tcMar>
+              <w:top w:type="dxa" w:w="40"/>
+              <w:left w:type="dxa" w:w="80"/>
+              <w:bottom w:type="dxa" w:w="40"/>
+              <w:right w:type="dxa" w:w="80"/>
+            </w:tcMar>
+          </w:tcPr>
+          <w:p>
+            <w:r>
+              <w:rPr>
+                <w:b/>
+                <w:bCs/>
+                <w:sz w:val="17"/>
+                <w:szCs w:val="17"/>
+              </w:rPr>
+              <w:t xml:space="preserve">Part</w:t>
+            </w:r>
+          </w:p>
+        </w:tc>
+        <w:tc>
+          <w:tcPr>
+            <w:tcW w:type="dxa" w:w="3212"/>
+            <w:tcBorders>
+              <w:top w:val="single" w:color="C4C0B6" w:sz="4"/>
+              <w:left w:val="single" w:color="C4C0B6" w:sz="4"/>
+              <w:bottom w:val="single" w:color="C4C0B6" w:sz="4"/>
+              <w:right w:val="single" w:color="C4C0B6" w:sz="4"/>
+            </w:tcBorders>
+            <w:shd w:fill="E9E4DC" w:color="auto" w:val="clear"/>
+            <w:tcMar>
+              <w:top w:type="dxa" w:w="40"/>
+              <w:left w:type="dxa" w:w="80"/>
+              <w:bottom w:type="dxa" w:w="40"/>
+              <w:right w:type="dxa" w:w="80"/>
+            </w:tcMar>
+          </w:tcPr>
+          <w:p>
+            <w:r>
+              <w:rPr>
+                <w:b/>
+                <w:bCs/>
+                <w:sz w:val="17"/>
+                <w:szCs w:val="17"/>
+              </w:rPr>
+              <w:t xml:space="preserve">The pixel is mining…</w:t>
+            </w:r>
+          </w:p>
+        </w:tc>
+        <w:tc>
+          <w:tcPr>
+            <w:tcW w:type="dxa" w:w="3212"/>
+            <w:tcBorders>
+              <w:top w:val="single" w:color="C4C0B6" w:sz="4"/>
+              <w:left w:val="single" w:color="C4C0B6" w:sz="4"/>
+              <w:bottom w:val="single" w:color="C4C0B6" w:sz="4"/>
+              <w:right w:val="single" w:color="C4C0B6" w:sz="4"/>
+            </w:tcBorders>
+            <w:shd w:fill="E9E4DC" w:color="auto" w:val="clear"/>
+            <w:tcMar>
+              <w:top w:type="dxa" w:w="40"/>
+              <w:left w:type="dxa" w:w="80"/>
+              <w:bottom w:type="dxa" w:w="40"/>
+              <w:right w:type="dxa" w:w="80"/>
+            </w:tcMar>
+          </w:tcPr>
+          <w:p>
+            <w:r>
+              <w:rPr>
+                <w:b/>
+                <w:bCs/>
+                <w:sz w:val="17"/>
+                <w:szCs w:val="17"/>
+              </w:rPr>
+              <w:t xml:space="preserve">Meaning</w:t>
+            </w:r>
+          </w:p>
+        </w:tc>
+      </w:tr>
+      <w:tr>
+        <w:tc>
+          <w:tcPr>
+            <w:tcW w:type="dxa" w:w="3212"/>
+            <w:tcBorders>
+              <w:top w:val="single" w:color="C4C0B6" w:sz="4"/>
+              <w:left w:val="single" w:color="C4C0B6" w:sz="4"/>
+              <w:bottom w:val="single" w:color="C4C0B6" w:sz="4"/>
+              <w:right w:val="single" w:color="C4C0B6" w:sz="4"/>
+            </w:tcBorders>
+            <w:tcMar>
+              <w:top w:type="dxa" w:w="40"/>
+              <w:left w:type="dxa" w:w="80"/>
+              <w:bottom w:type="dxa" w:w="40"/>
+              <w:right w:type="dxa" w:w="80"/>
+            </w:tcMar>
+          </w:tcPr>
+          <w:p>
+            <w:r>
+              <w:rPr>
+                <w:b/>
+                <w:bCs/>
+                <w:sz w:val="17"/>
+                <w:szCs w:val="17"/>
+              </w:rPr>
+              <w:t xml:space="preserve">New land</w:t>
+            </w:r>
+          </w:p>
+        </w:tc>
+        <w:tc>
+          <w:tcPr>
+            <w:tcW w:type="dxa" w:w="3212"/>
+            <w:tcBorders>
+              <w:top w:val="single" w:color="C4C0B6" w:sz="4"/>
+              <w:left w:val="single" w:color="C4C0B6" w:sz="4"/>
+              <w:bottom w:val="single" w:color="C4C0B6" w:sz="4"/>
+              <w:right w:val="single" w:color="C4C0B6" w:sz="4"/>
+            </w:tcBorders>
+            <w:tcMar>
+              <w:top w:type="dxa" w:w="40"/>
+              <w:left w:type="dxa" w:w="80"/>
+              <w:bottom w:type="dxa" w:w="40"/>
+              <w:right w:type="dxa" w:w="80"/>
+            </w:tcMar>
+          </w:tcPr>
+          <w:p>
+            <w:r>
+              <w:rPr>
+                <w:sz w:val="17"/>
+                <w:szCs w:val="17"/>
+              </w:rPr>
+              <w:t xml:space="preserve">in </w:t>
+            </w:r>
+            <w:r>
+              <w:rPr>
+                <w:i/>
+                <w:iCs/>
+                <w:sz w:val="17"/>
+                <w:szCs w:val="17"/>
+              </w:rPr>
+              <w:t xml:space="preserve">t</w:t>
+            </w:r>
+            <w:r>
+              <w:rPr>
+                <w:sz w:val="17"/>
+                <w:szCs w:val="17"/>
+              </w:rPr>
+              <w:t xml:space="preserve">, and in no earlier year since 1985</w:t>
+            </w:r>
+          </w:p>
+        </w:tc>
+        <w:tc>
+          <w:tcPr>
+            <w:tcW w:type="dxa" w:w="3212"/>
+            <w:tcBorders>
+              <w:top w:val="single" w:color="C4C0B6" w:sz="4"/>
+              <w:left w:val="single" w:color="C4C0B6" w:sz="4"/>
+              <w:bottom w:val="single" w:color="C4C0B6" w:sz="4"/>
+              <w:right w:val="single" w:color="C4C0B6" w:sz="4"/>
+            </w:tcBorders>
+            <w:tcMar>
+              <w:top w:type="dxa" w:w="40"/>
+              <w:left w:type="dxa" w:w="80"/>
+              <w:bottom w:type="dxa" w:w="40"/>
+              <w:right w:type="dxa" w:w="80"/>
+            </w:tcMar>
+          </w:tcPr>
+          <w:p>
+            <w:r>
+              <w:rPr>
+                <w:sz w:val="17"/>
+                <w:szCs w:val="17"/>
+              </w:rPr>
+              <w:t xml:space="preserve">first-time mining, usually cleared forest</w:t>
+            </w:r>
+          </w:p>
+        </w:tc>
+      </w:tr>
+      <w:tr>
+        <w:tc>
+          <w:tcPr>
+            <w:tcW w:type="dxa" w:w="3212"/>
+            <w:tcBorders>
+              <w:top w:val="single" w:color="C4C0B6" w:sz="4"/>
+              <w:left w:val="single" w:color="C4C0B6" w:sz="4"/>
+              <w:bottom w:val="single" w:color="C4C0B6" w:sz="4"/>
+              <w:right w:val="single" w:color="C4C0B6" w:sz="4"/>
+            </w:tcBorders>
+            <w:tcMar>
+              <w:top w:type="dxa" w:w="40"/>
+              <w:left w:type="dxa" w:w="80"/>
+              <w:bottom w:type="dxa" w:w="40"/>
+              <w:right w:type="dxa" w:w="80"/>
+            </w:tcMar>
+          </w:tcPr>
+          <w:p>
+            <w:r>
+              <w:rPr>
+                <w:b/>
+                <w:bCs/>
+                <w:sz w:val="17"/>
+                <w:szCs w:val="17"/>
+              </w:rPr>
+              <w:t xml:space="preserve">Re-mined</w:t>
+            </w:r>
+          </w:p>
+        </w:tc>
+        <w:tc>
+          <w:tcPr>
+            <w:tcW w:type="dxa" w:w="3212"/>
+            <w:tcBorders>
+              <w:top w:val="single" w:color="C4C0B6" w:sz="4"/>
+              <w:left w:val="single" w:color="C4C0B6" w:sz="4"/>
+              <w:bottom w:val="single" w:color="C4C0B6" w:sz="4"/>
+              <w:right w:val="single" w:color="C4C0B6" w:sz="4"/>
+            </w:tcBorders>
+            <w:tcMar>
+              <w:top w:type="dxa" w:w="40"/>
+              <w:left w:type="dxa" w:w="80"/>
+              <w:bottom w:type="dxa" w:w="40"/>
+              <w:right w:type="dxa" w:w="80"/>
+            </w:tcMar>
+          </w:tcPr>
+          <w:p>
+            <w:r>
+              <w:rPr>
+                <w:sz w:val="17"/>
+                <w:szCs w:val="17"/>
+              </w:rPr>
+              <w:t xml:space="preserve">in </w:t>
+            </w:r>
+            <w:r>
+              <w:rPr>
+                <w:i/>
+                <w:iCs/>
+                <w:sz w:val="17"/>
+                <w:szCs w:val="17"/>
+              </w:rPr>
+              <w:t xml:space="preserve">t</w:t>
+            </w:r>
+            <w:r>
+              <w:rPr>
+                <w:sz w:val="17"/>
+                <w:szCs w:val="17"/>
+              </w:rPr>
+              <w:t xml:space="preserve">, not in </w:t>
+            </w:r>
+            <w:r>
+              <w:rPr>
+                <w:i/>
+                <w:iCs/>
+                <w:sz w:val="17"/>
+                <w:szCs w:val="17"/>
+              </w:rPr>
+              <w:t xml:space="preserve">t</w:t>
+            </w:r>
+            <w:r>
+              <w:rPr>
+                <w:sz w:val="17"/>
+                <w:szCs w:val="17"/>
+              </w:rPr>
+              <w:t xml:space="preserve"> − 1, but in some year before </w:t>
+            </w:r>
+            <w:r>
+              <w:rPr>
+                <w:i/>
+                <w:iCs/>
+                <w:sz w:val="17"/>
+                <w:szCs w:val="17"/>
+              </w:rPr>
+              <w:t xml:space="preserve">t</w:t>
+            </w:r>
+            <w:r>
+              <w:rPr>
+                <w:sz w:val="17"/>
+                <w:szCs w:val="17"/>
+              </w:rPr>
+              <w:t xml:space="preserve"> − 1</w:t>
+            </w:r>
+          </w:p>
+        </w:tc>
+        <w:tc>
+          <w:tcPr>
+            <w:tcW w:type="dxa" w:w="3212"/>
+            <w:tcBorders>
+              <w:top w:val="single" w:color="C4C0B6" w:sz="4"/>
+              <w:left w:val="single" w:color="C4C0B6" w:sz="4"/>
+              <w:bottom w:val="single" w:color="C4C0B6" w:sz="4"/>
+              <w:right w:val="single" w:color="C4C0B6" w:sz="4"/>
+            </w:tcBorders>
+            <w:tcMar>
+              <w:top w:type="dxa" w:w="40"/>
+              <w:left w:type="dxa" w:w="80"/>
+              <w:bottom w:type="dxa" w:w="40"/>
+              <w:right w:type="dxa" w:w="80"/>
+            </w:tcMar>
+          </w:tcPr>
+          <w:p>
+            <w:r>
+              <w:rPr>
+                <w:sz w:val="17"/>
+                <w:szCs w:val="17"/>
+              </w:rPr>
+              <w:t xml:space="preserve">an old pit that was out of use for at least one year and is worked again (a pit mined in both </w:t>
+            </w:r>
+            <w:r>
+              <w:rPr>
+                <w:i/>
+                <w:iCs/>
+                <w:sz w:val="17"/>
+                <w:szCs w:val="17"/>
+              </w:rPr>
+              <w:t xml:space="preserve">t</w:t>
+            </w:r>
+            <w:r>
+              <w:rPr>
+                <w:sz w:val="17"/>
+                <w:szCs w:val="17"/>
+              </w:rPr>
+              <w:t xml:space="preserve"> − 1 and </w:t>
+            </w:r>
+            <w:r>
+              <w:rPr>
+                <w:i/>
+                <w:iCs/>
+                <w:sz w:val="17"/>
+                <w:szCs w:val="17"/>
+              </w:rPr>
+              <w:t xml:space="preserve">t</w:t>
+            </w:r>
+            <w:r>
+              <w:rPr>
+                <w:sz w:val="17"/>
+                <w:szCs w:val="17"/>
+              </w:rPr>
+              <w:t xml:space="preserve"> is in none of the three flows: it stays in the stock)</w:t>
+            </w:r>
+          </w:p>
+        </w:tc>
+      </w:tr>
+      <w:tr>
+        <w:tc>
+          <w:tcPr>
+            <w:tcW w:type="dxa" w:w="3212"/>
+            <w:tcBorders>
+              <w:top w:val="single" w:color="C4C0B6" w:sz="4"/>
+              <w:left w:val="single" w:color="C4C0B6" w:sz="4"/>
+              <w:bottom w:val="single" w:color="C4C0B6" w:sz="4"/>
+              <w:right w:val="single" w:color="C4C0B6" w:sz="4"/>
+            </w:tcBorders>
+            <w:tcMar>
+              <w:top w:type="dxa" w:w="40"/>
+              <w:left w:type="dxa" w:w="80"/>
+              <w:bottom w:type="dxa" w:w="40"/>
+              <w:right w:type="dxa" w:w="80"/>
+            </w:tcMar>
+          </w:tcPr>
+          <w:p>
+            <w:r>
+              <w:rPr>
+                <w:b/>
+                <w:bCs/>
+                <w:sz w:val="17"/>
+                <w:szCs w:val="17"/>
+              </w:rPr>
+              <w:t xml:space="preserve">Stopped</w:t>
+            </w:r>
+          </w:p>
+        </w:tc>
+        <w:tc>
+          <w:tcPr>
+            <w:tcW w:type="dxa" w:w="3212"/>
+            <w:tcBorders>
+              <w:top w:val="single" w:color="C4C0B6" w:sz="4"/>
+              <w:left w:val="single" w:color="C4C0B6" w:sz="4"/>
+              <w:bottom w:val="single" w:color="C4C0B6" w:sz="4"/>
+              <w:right w:val="single" w:color="C4C0B6" w:sz="4"/>
+            </w:tcBorders>
+            <w:tcMar>
+              <w:top w:type="dxa" w:w="40"/>
+              <w:left w:type="dxa" w:w="80"/>
+              <w:bottom w:type="dxa" w:w="40"/>
+              <w:right w:type="dxa" w:w="80"/>
+            </w:tcMar>
+          </w:tcPr>
+          <w:p>
+            <w:r>
+              <w:rPr>
+                <w:sz w:val="17"/>
+                <w:szCs w:val="17"/>
+              </w:rPr>
+              <w:t xml:space="preserve">in </w:t>
+            </w:r>
+            <w:r>
+              <w:rPr>
+                <w:i/>
+                <w:iCs/>
+                <w:sz w:val="17"/>
+                <w:szCs w:val="17"/>
+              </w:rPr>
+              <w:t xml:space="preserve">t</w:t>
+            </w:r>
+            <w:r>
+              <w:rPr>
+                <w:sz w:val="17"/>
+                <w:szCs w:val="17"/>
+              </w:rPr>
+              <w:t xml:space="preserve"> − 1, not in </w:t>
+            </w:r>
+            <w:r>
+              <w:rPr>
+                <w:i/>
+                <w:iCs/>
+                <w:sz w:val="17"/>
+                <w:szCs w:val="17"/>
+              </w:rPr>
+              <w:t xml:space="preserve">t</w:t>
+            </w:r>
+          </w:p>
+        </w:tc>
+        <w:tc>
+          <w:tcPr>
+            <w:tcW w:type="dxa" w:w="3212"/>
+            <w:tcBorders>
+              <w:top w:val="single" w:color="C4C0B6" w:sz="4"/>
+              <w:left w:val="single" w:color="C4C0B6" w:sz="4"/>
+              <w:bottom w:val="single" w:color="C4C0B6" w:sz="4"/>
+              <w:right w:val="single" w:color="C4C0B6" w:sz="4"/>
+            </w:tcBorders>
+            <w:tcMar>
+              <w:top w:type="dxa" w:w="40"/>
+              <w:left w:type="dxa" w:w="80"/>
+              <w:bottom w:type="dxa" w:w="40"/>
+              <w:right w:type="dxa" w:w="80"/>
+            </w:tcMar>
+          </w:tcPr>
+          <w:p>
+            <w:r>
+              <w:rPr>
+                <w:sz w:val="17"/>
+                <w:szCs w:val="17"/>
+              </w:rPr>
+              <w:t xml:space="preserve">a pit that left the mining class: flooded, regrowing, bare or reclassified</w:t>
+            </w:r>
+          </w:p>
+        </w:tc>
+      </w:tr>
+    </w:tbl>
+    <w:p>
+      <w:pPr>
+        <w:spacing w:after="80"/>
+      </w:pPr>
+    </w:p>
+    <w:p>
+      <w:pPr>
+        <w:spacing w:after="100"/>
+      </w:pPr>
+      <w:r>
+        <w:rPr>
+          <w:b/>
+          <w:bCs/>
+        </w:rPr>
+        <w:t xml:space="preserve">Net additions</w:t>
+      </w:r>
+      <w:r>
+        <w:t xml:space="preserve"> = new land + re-mined − stopped = mining area in </w:t>
+      </w:r>
+      <w:r>
+        <w:rPr>
+          <w:i/>
+          <w:iCs/>
+        </w:rPr>
+        <w:t xml:space="preserve">t</w:t>
+      </w:r>
+      <w:r>
+        <w:t xml:space="preserve"> − mining area in </w:t>
+      </w:r>
+      <w:r>
+        <w:rPr>
+          <w:i/>
+          <w:iCs/>
+        </w:rPr>
+        <w:t xml:space="preserve">t</w:t>
+      </w:r>
+      <w:r>
+        <w:t xml:space="preserve"> − 1 (checked for every zone and year). Hectares measure mining activity on land, not the number of miners.</w:t>
+      </w:r>
+    </w:p>
+    <w:p>
+      <w:pPr>
+        <w:spacing w:after="100"/>
+      </w:pPr>
+      <w:r>
+        <w:rPr>
+          <w:b/>
+          <w:bCs/>
+        </w:rPr>
+        <w:t xml:space="preserve">Zones</w:t>
+      </w:r>
+      <w:r>
+        <w:t xml:space="preserve"> (</w:t>
+      </w:r>
       <w:r>
         <w:rPr>
           <w:rFonts w:ascii="Consolas" w:cs="Consolas" w:eastAsia="Consolas" w:hAnsi="Consolas"/>
           <w:sz w:val="18"/>
           <w:szCs w:val="18"/>
         </w:rPr>
-        <w:t xml:space="preserve">DOWNLOAD_LOG.csv</w:t>
-      </w:r>
-      <w:r>
-        <w:t xml:space="preserve"> has one row per raw file (or per set of identical-format files): source, URL, collection, theme, years, access date, downloader and check number. Files above 50 MB and files with personal data are not in the zip; the log links them. Definitions used everywhere (</w:t>
+        <w:t xml:space="preserve">code/definitions.py</w:t>
+      </w:r>
+      <w:r>
+        <w:t xml:space="preserve">, one registry for every number): official SERNANP buffer zones kept whole (where they overlap, the land goes to Tambopata, as MapBiomas does; the Kotsimba native community lies inside the Tambopata buffer zone); the </w:t>
+      </w:r>
+      <w:r>
+        <w:rPr>
+          <w:b/>
+          <w:bCs/>
+        </w:rPr>
+        <w:t xml:space="preserve">La Pampa sector</w:t>
+      </w:r>
+      <w:r>
+        <w:t xml:space="preserve"> = the Tambopata buffer zone between 70.15° and 69.80° W; the </w:t>
+      </w:r>
+      <w:r>
+        <w:rPr>
+          <w:b/>
+          <w:bCs/>
+        </w:rPr>
+        <w:t xml:space="preserve">corridor across the road</w:t>
+      </w:r>
+      <w:r>
+        <w:t xml:space="preserve"> = D.L. 1100 mining-corridor land up to 10 km north of the Interoceanic Highway at La Pampa's longitudes; the </w:t>
+      </w:r>
+      <w:r>
+        <w:rPr>
+          <w:b/>
+          <w:bCs/>
+        </w:rPr>
+        <w:t xml:space="preserve">legal mining corridor</w:t>
+      </w:r>
+      <w:r>
+        <w:t xml:space="preserve"> = all D.L. 1100 land outside buffer zones; native communities; the rest of Madre de Dios. </w:t>
+      </w:r>
+      <w:r>
+        <w:rPr>
+          <w:b/>
+          <w:bCs/>
+        </w:rPr>
+        <w:t xml:space="preserve">Treatment:</w:t>
+      </w:r>
+      <w:r>
+        <w:t xml:space="preserve"> start of Operation Mercurio, February 2019; first treated year 2019; reference year 2018. </w:t>
+      </w:r>
+      <w:r>
+        <w:rPr>
+          <w:b/>
+          <w:bCs/>
+        </w:rPr>
+        <w:t xml:space="preserve">Periods:</w:t>
+      </w:r>
+      <w:r>
+        <w:t xml:space="preserve"> 2016–18 (before), 2019–21, 2022–25 (later years, also reported without 2023).</w:t>
+      </w:r>
+    </w:p>
+    <w:p>
+      <w:pPr>
+        <w:spacing w:after="100"/>
+      </w:pPr>
+      <w:r>
+        <w:rPr>
+          <w:b/>
+          <w:bCs/>
+        </w:rPr>
+        <w:t xml:space="preserve">Data log.</w:t>
+      </w:r>
+      <w:r>
+        <w:t xml:space="preserve"> </w:t>
       </w:r>
       <w:r>
         <w:rPr>
@@ -1188,10 +2766,10 @@
           <w:sz w:val="18"/>
           <w:szCs w:val="18"/>
         </w:rPr>
-        <w:t xml:space="preserve">code/definitions.py</w:t>
-      </w:r>
-      <w:r>
-        <w:t xml:space="preserve">): net additions = new + re-mined − stopped; zones = official SERNANP buffer zones kept whole (overlaps go to Tambopata, as MapBiomas does), the La Pampa sector, the D.L. 1100 corridor outside buffer zones (across the road: ≤ 10 km north of the highway at La Pampa's longitudes), native communities, rest of Madre de Dios; periods 2016–18, 2019–21, 2022–25. </w:t>
+        <w:t xml:space="preserve">DOWNLOAD_LOG.csv</w:t>
+      </w:r>
+      <w:r>
+        <w:t xml:space="preserve"> has one row per raw file (or per set of files with the same format): source, URL, collection, theme, years, access date, downloader and check number. Files above 50 MB and files with personal data are not in the zip; the log links them. </w:t>
       </w:r>
       <w:r>
         <w:rPr>
@@ -1202,7 +2780,7 @@
         <w:t xml:space="preserve">output/brief_numbers.csv</w:t>
       </w:r>
       <w:r>
-        <w:t xml:space="preserve"> lists every number in this brief, in order of appearance, with its measure, zone and period.</w:t>
+        <w:t xml:space="preserve"> lists every number in this brief in order of appearance, with its measure, zone and period.</w:t>
       </w:r>
     </w:p>
     <w:p>
@@ -1250,7 +2828,7 @@
         <w:t xml:space="preserve">Raw answer:</w:t>
       </w:r>
       <w:r>
-        <w:t xml:space="preserve"> reproduced in full below (Appendix B1). </w:t>
+        <w:t xml:space="preserve"> reproduced in full at the end (Appendix B1). </w:t>
       </w:r>
       <w:r>
         <w:rPr>
@@ -1353,6 +2931,1058 @@
       </w:r>
       <w:r>
         <w:t xml:space="preserve"> the AI dates follow-up operations under "Plan Restauración extensions" in 2019; Plan Restauración is from 2021 (MINAM, 2021).</w:t>
+      </w:r>
+    </w:p>
+    <w:p>
+      <w:pPr>
+        <w:pStyle w:val="Heading1"/>
+      </w:pPr>
+      <w:r>
+        <w:t xml:space="preserve">Appendix C. Six methods for cause, in one table</w:t>
+      </w:r>
+    </w:p>
+    <w:p>
+      <w:pPr>
+        <w:spacing w:after="100"/>
+      </w:pPr>
+      <w:r>
+        <w:t xml:space="preserve">All on net additions, Tambopata buffer zone, 2019–21. None passes all of its own checks, so every result is a description of how far the target differs from a stand-in.</w:t>
+      </w:r>
+    </w:p>
+    <w:tbl>
+      <w:tblPr>
+        <w:tblW w:type="dxa" w:w="9636"/>
+        <w:tblBorders>
+          <w:top w:val="single" w:color="auto" w:sz="4"/>
+          <w:left w:val="single" w:color="auto" w:sz="4"/>
+          <w:bottom w:val="single" w:color="auto" w:sz="4"/>
+          <w:right w:val="single" w:color="auto" w:sz="4"/>
+          <w:insideH w:val="single" w:color="auto" w:sz="4"/>
+          <w:insideV w:val="single" w:color="auto" w:sz="4"/>
+        </w:tblBorders>
+      </w:tblPr>
+      <w:tblGrid>
+        <w:gridCol w:w="2409"/>
+        <w:gridCol w:w="2409"/>
+        <w:gridCol w:w="2409"/>
+        <w:gridCol w:w="2409"/>
+      </w:tblGrid>
+      <w:tr>
+        <w:trPr>
+          <w:tblHeader/>
+        </w:trPr>
+        <w:tc>
+          <w:tcPr>
+            <w:tcW w:type="dxa" w:w="2409"/>
+            <w:tcBorders>
+              <w:top w:val="single" w:color="C4C0B6" w:sz="4"/>
+              <w:left w:val="single" w:color="C4C0B6" w:sz="4"/>
+              <w:bottom w:val="single" w:color="C4C0B6" w:sz="4"/>
+              <w:right w:val="single" w:color="C4C0B6" w:sz="4"/>
+            </w:tcBorders>
+            <w:shd w:fill="E9E4DC" w:color="auto" w:val="clear"/>
+            <w:tcMar>
+              <w:top w:type="dxa" w:w="40"/>
+              <w:left w:type="dxa" w:w="80"/>
+              <w:bottom w:type="dxa" w:w="40"/>
+              <w:right w:type="dxa" w:w="80"/>
+            </w:tcMar>
+          </w:tcPr>
+          <w:p>
+            <w:r>
+              <w:rPr>
+                <w:b/>
+                <w:bCs/>
+                <w:sz w:val="17"/>
+                <w:szCs w:val="17"/>
+              </w:rPr>
+              <w:t xml:space="preserve">Method</w:t>
+            </w:r>
+          </w:p>
+        </w:tc>
+        <w:tc>
+          <w:tcPr>
+            <w:tcW w:type="dxa" w:w="2409"/>
+            <w:tcBorders>
+              <w:top w:val="single" w:color="C4C0B6" w:sz="4"/>
+              <w:left w:val="single" w:color="C4C0B6" w:sz="4"/>
+              <w:bottom w:val="single" w:color="C4C0B6" w:sz="4"/>
+              <w:right w:val="single" w:color="C4C0B6" w:sz="4"/>
+            </w:tcBorders>
+            <w:shd w:fill="E9E4DC" w:color="auto" w:val="clear"/>
+            <w:tcMar>
+              <w:top w:type="dxa" w:w="40"/>
+              <w:left w:type="dxa" w:w="80"/>
+              <w:bottom w:type="dxa" w:w="40"/>
+              <w:right w:type="dxa" w:w="80"/>
+            </w:tcMar>
+          </w:tcPr>
+          <w:p>
+            <w:r>
+              <w:rPr>
+                <w:b/>
+                <w:bCs/>
+                <w:sz w:val="17"/>
+                <w:szCs w:val="17"/>
+              </w:rPr>
+              <w:t xml:space="preserve">Compares Tambopata with</w:t>
+            </w:r>
+          </w:p>
+        </w:tc>
+        <w:tc>
+          <w:tcPr>
+            <w:tcW w:type="dxa" w:w="2409"/>
+            <w:tcBorders>
+              <w:top w:val="single" w:color="C4C0B6" w:sz="4"/>
+              <w:left w:val="single" w:color="C4C0B6" w:sz="4"/>
+              <w:bottom w:val="single" w:color="C4C0B6" w:sz="4"/>
+              <w:right w:val="single" w:color="C4C0B6" w:sz="4"/>
+            </w:tcBorders>
+            <w:shd w:fill="E9E4DC" w:color="auto" w:val="clear"/>
+            <w:tcMar>
+              <w:top w:type="dxa" w:w="40"/>
+              <w:left w:type="dxa" w:w="80"/>
+              <w:bottom w:type="dxa" w:w="40"/>
+              <w:right w:type="dxa" w:w="80"/>
+            </w:tcMar>
+          </w:tcPr>
+          <w:p>
+            <w:r>
+              <w:rPr>
+                <w:b/>
+                <w:bCs/>
+                <w:sz w:val="17"/>
+                <w:szCs w:val="17"/>
+              </w:rPr>
+              <w:t xml:space="preserve">Result</w:t>
+            </w:r>
+          </w:p>
+        </w:tc>
+        <w:tc>
+          <w:tcPr>
+            <w:tcW w:type="dxa" w:w="2409"/>
+            <w:tcBorders>
+              <w:top w:val="single" w:color="C4C0B6" w:sz="4"/>
+              <w:left w:val="single" w:color="C4C0B6" w:sz="4"/>
+              <w:bottom w:val="single" w:color="C4C0B6" w:sz="4"/>
+              <w:right w:val="single" w:color="C4C0B6" w:sz="4"/>
+            </w:tcBorders>
+            <w:shd w:fill="E9E4DC" w:color="auto" w:val="clear"/>
+            <w:tcMar>
+              <w:top w:type="dxa" w:w="40"/>
+              <w:left w:type="dxa" w:w="80"/>
+              <w:bottom w:type="dxa" w:w="40"/>
+              <w:right w:type="dxa" w:w="80"/>
+            </w:tcMar>
+          </w:tcPr>
+          <w:p>
+            <w:r>
+              <w:rPr>
+                <w:b/>
+                <w:bCs/>
+                <w:sz w:val="17"/>
+                <w:szCs w:val="17"/>
+              </w:rPr>
+              <w:t xml:space="preserve">Verdict</w:t>
+            </w:r>
+          </w:p>
+        </w:tc>
+      </w:tr>
+      <w:tr>
+        <w:tc>
+          <w:tcPr>
+            <w:tcW w:type="dxa" w:w="2409"/>
+            <w:tcBorders>
+              <w:top w:val="single" w:color="C4C0B6" w:sz="4"/>
+              <w:left w:val="single" w:color="C4C0B6" w:sz="4"/>
+              <w:bottom w:val="single" w:color="C4C0B6" w:sz="4"/>
+              <w:right w:val="single" w:color="C4C0B6" w:sz="4"/>
+            </w:tcBorders>
+            <w:tcMar>
+              <w:top w:type="dxa" w:w="40"/>
+              <w:left w:type="dxa" w:w="80"/>
+              <w:bottom w:type="dxa" w:w="40"/>
+              <w:right w:type="dxa" w:w="80"/>
+            </w:tcMar>
+          </w:tcPr>
+          <w:p>
+            <w:r>
+              <w:rPr>
+                <w:sz w:val="17"/>
+                <w:szCs w:val="17"/>
+              </w:rPr>
+              <w:t xml:space="preserve">Zone and year effects (difference-in-differences)</w:t>
+            </w:r>
+          </w:p>
+        </w:tc>
+        <w:tc>
+          <w:tcPr>
+            <w:tcW w:type="dxa" w:w="2409"/>
+            <w:tcBorders>
+              <w:top w:val="single" w:color="C4C0B6" w:sz="4"/>
+              <w:left w:val="single" w:color="C4C0B6" w:sz="4"/>
+              <w:bottom w:val="single" w:color="C4C0B6" w:sz="4"/>
+              <w:right w:val="single" w:color="C4C0B6" w:sz="4"/>
+            </w:tcBorders>
+            <w:tcMar>
+              <w:top w:type="dxa" w:w="40"/>
+              <w:left w:type="dxa" w:w="80"/>
+              <w:bottom w:type="dxa" w:w="40"/>
+              <w:right w:type="dxa" w:w="80"/>
+            </w:tcMar>
+          </w:tcPr>
+          <w:p>
+            <w:r>
+              <w:rPr>
+                <w:sz w:val="17"/>
+                <w:szCs w:val="17"/>
+              </w:rPr>
+              <w:t xml:space="preserve">14 other Peruvian buffer zones</w:t>
+            </w:r>
+          </w:p>
+        </w:tc>
+        <w:tc>
+          <w:tcPr>
+            <w:tcW w:type="dxa" w:w="2409"/>
+            <w:tcBorders>
+              <w:top w:val="single" w:color="C4C0B6" w:sz="4"/>
+              <w:left w:val="single" w:color="C4C0B6" w:sz="4"/>
+              <w:bottom w:val="single" w:color="C4C0B6" w:sz="4"/>
+              <w:right w:val="single" w:color="C4C0B6" w:sz="4"/>
+            </w:tcBorders>
+            <w:tcMar>
+              <w:top w:type="dxa" w:w="40"/>
+              <w:left w:type="dxa" w:w="80"/>
+              <w:bottom w:type="dxa" w:w="40"/>
+              <w:right w:type="dxa" w:w="80"/>
+            </w:tcMar>
+          </w:tcPr>
+          <w:p>
+            <w:r>
+              <w:rPr>
+                <w:sz w:val="17"/>
+                <w:szCs w:val="17"/>
+              </w:rPr>
+              <w:t xml:space="preserve">−1,453 ha/yr; largest of 15 in hectares, 4th of 7 relative to size</w:t>
+            </w:r>
+          </w:p>
+        </w:tc>
+        <w:tc>
+          <w:tcPr>
+            <w:tcW w:type="dxa" w:w="2409"/>
+            <w:tcBorders>
+              <w:top w:val="single" w:color="C4C0B6" w:sz="4"/>
+              <w:left w:val="single" w:color="C4C0B6" w:sz="4"/>
+              <w:bottom w:val="single" w:color="C4C0B6" w:sz="4"/>
+              <w:right w:val="single" w:color="C4C0B6" w:sz="4"/>
+            </w:tcBorders>
+            <w:tcMar>
+              <w:top w:type="dxa" w:w="40"/>
+              <w:left w:type="dxa" w:w="80"/>
+              <w:bottom w:type="dxa" w:w="40"/>
+              <w:right w:type="dxa" w:w="80"/>
+            </w:tcMar>
+          </w:tcPr>
+          <w:p>
+            <w:r>
+              <w:rPr>
+                <w:sz w:val="17"/>
+                <w:szCs w:val="17"/>
+              </w:rPr>
+              <w:t xml:space="preserve">holds up, in hectares only</w:t>
+            </w:r>
+          </w:p>
+        </w:tc>
+      </w:tr>
+      <w:tr>
+        <w:tc>
+          <w:tcPr>
+            <w:tcW w:type="dxa" w:w="2409"/>
+            <w:tcBorders>
+              <w:top w:val="single" w:color="C4C0B6" w:sz="4"/>
+              <w:left w:val="single" w:color="C4C0B6" w:sz="4"/>
+              <w:bottom w:val="single" w:color="C4C0B6" w:sz="4"/>
+              <w:right w:val="single" w:color="C4C0B6" w:sz="4"/>
+            </w:tcBorders>
+            <w:tcMar>
+              <w:top w:type="dxa" w:w="40"/>
+              <w:left w:type="dxa" w:w="80"/>
+              <w:bottom w:type="dxa" w:w="40"/>
+              <w:right w:type="dxa" w:w="80"/>
+            </w:tcMar>
+          </w:tcPr>
+          <w:p>
+            <w:r>
+              <w:rPr>
+                <w:sz w:val="17"/>
+                <w:szCs w:val="17"/>
+              </w:rPr>
+              <w:t xml:space="preserve">Simple before/after vs Amarakaeri</w:t>
+            </w:r>
+          </w:p>
+        </w:tc>
+        <w:tc>
+          <w:tcPr>
+            <w:tcW w:type="dxa" w:w="2409"/>
+            <w:tcBorders>
+              <w:top w:val="single" w:color="C4C0B6" w:sz="4"/>
+              <w:left w:val="single" w:color="C4C0B6" w:sz="4"/>
+              <w:bottom w:val="single" w:color="C4C0B6" w:sz="4"/>
+              <w:right w:val="single" w:color="C4C0B6" w:sz="4"/>
+            </w:tcBorders>
+            <w:tcMar>
+              <w:top w:type="dxa" w:w="40"/>
+              <w:left w:type="dxa" w:w="80"/>
+              <w:bottom w:type="dxa" w:w="40"/>
+              <w:right w:type="dxa" w:w="80"/>
+            </w:tcMar>
+          </w:tcPr>
+          <w:p>
+            <w:r>
+              <w:rPr>
+                <w:sz w:val="17"/>
+                <w:szCs w:val="17"/>
+              </w:rPr>
+              <w:t xml:space="preserve">Amarakaeri buffer zone (2014–18 base)</w:t>
+            </w:r>
+          </w:p>
+        </w:tc>
+        <w:tc>
+          <w:tcPr>
+            <w:tcW w:type="dxa" w:w="2409"/>
+            <w:tcBorders>
+              <w:top w:val="single" w:color="C4C0B6" w:sz="4"/>
+              <w:left w:val="single" w:color="C4C0B6" w:sz="4"/>
+              <w:bottom w:val="single" w:color="C4C0B6" w:sz="4"/>
+              <w:right w:val="single" w:color="C4C0B6" w:sz="4"/>
+            </w:tcBorders>
+            <w:tcMar>
+              <w:top w:type="dxa" w:w="40"/>
+              <w:left w:type="dxa" w:w="80"/>
+              <w:bottom w:type="dxa" w:w="40"/>
+              <w:right w:type="dxa" w:w="80"/>
+            </w:tcMar>
+          </w:tcPr>
+          <w:p>
+            <w:r>
+              <w:rPr>
+                <w:sz w:val="17"/>
+                <w:szCs w:val="17"/>
+              </w:rPr>
+              <w:t xml:space="preserve">−1,663 ha/yr</w:t>
+            </w:r>
+          </w:p>
+        </w:tc>
+        <w:tc>
+          <w:tcPr>
+            <w:tcW w:type="dxa" w:w="2409"/>
+            <w:tcBorders>
+              <w:top w:val="single" w:color="C4C0B6" w:sz="4"/>
+              <w:left w:val="single" w:color="C4C0B6" w:sz="4"/>
+              <w:bottom w:val="single" w:color="C4C0B6" w:sz="4"/>
+              <w:right w:val="single" w:color="C4C0B6" w:sz="4"/>
+            </w:tcBorders>
+            <w:tcMar>
+              <w:top w:type="dxa" w:w="40"/>
+              <w:left w:type="dxa" w:w="80"/>
+              <w:bottom w:type="dxa" w:w="40"/>
+              <w:right w:type="dxa" w:w="80"/>
+            </w:tcMar>
+          </w:tcPr>
+          <w:p>
+            <w:r>
+              <w:rPr>
+                <w:sz w:val="17"/>
+                <w:szCs w:val="17"/>
+              </w:rPr>
+              <w:t xml:space="preserve">other end of the range</w:t>
+            </w:r>
+          </w:p>
+        </w:tc>
+      </w:tr>
+      <w:tr>
+        <w:tc>
+          <w:tcPr>
+            <w:tcW w:type="dxa" w:w="2409"/>
+            <w:tcBorders>
+              <w:top w:val="single" w:color="C4C0B6" w:sz="4"/>
+              <w:left w:val="single" w:color="C4C0B6" w:sz="4"/>
+              <w:bottom w:val="single" w:color="C4C0B6" w:sz="4"/>
+              <w:right w:val="single" w:color="C4C0B6" w:sz="4"/>
+            </w:tcBorders>
+            <w:tcMar>
+              <w:top w:type="dxa" w:w="40"/>
+              <w:left w:type="dxa" w:w="80"/>
+              <w:bottom w:type="dxa" w:w="40"/>
+              <w:right w:type="dxa" w:w="80"/>
+            </w:tcMar>
+          </w:tcPr>
+          <w:p>
+            <w:r>
+              <w:rPr>
+                <w:sz w:val="17"/>
+                <w:szCs w:val="17"/>
+              </w:rPr>
+              <w:t xml:space="preserve">Synthetic difference-in-differences</w:t>
+            </w:r>
+          </w:p>
+        </w:tc>
+        <w:tc>
+          <w:tcPr>
+            <w:tcW w:type="dxa" w:w="2409"/>
+            <w:tcBorders>
+              <w:top w:val="single" w:color="C4C0B6" w:sz="4"/>
+              <w:left w:val="single" w:color="C4C0B6" w:sz="4"/>
+              <w:bottom w:val="single" w:color="C4C0B6" w:sz="4"/>
+              <w:right w:val="single" w:color="C4C0B6" w:sz="4"/>
+            </w:tcBorders>
+            <w:tcMar>
+              <w:top w:type="dxa" w:w="40"/>
+              <w:left w:type="dxa" w:w="80"/>
+              <w:bottom w:type="dxa" w:w="40"/>
+              <w:right w:type="dxa" w:w="80"/>
+            </w:tcMar>
+          </w:tcPr>
+          <w:p>
+            <w:r>
+              <w:rPr>
+                <w:sz w:val="17"/>
+                <w:szCs w:val="17"/>
+              </w:rPr>
+              <w:t xml:space="preserve">weighted zones and years</w:t>
+            </w:r>
+          </w:p>
+        </w:tc>
+        <w:tc>
+          <w:tcPr>
+            <w:tcW w:type="dxa" w:w="2409"/>
+            <w:tcBorders>
+              <w:top w:val="single" w:color="C4C0B6" w:sz="4"/>
+              <w:left w:val="single" w:color="C4C0B6" w:sz="4"/>
+              <w:bottom w:val="single" w:color="C4C0B6" w:sz="4"/>
+              <w:right w:val="single" w:color="C4C0B6" w:sz="4"/>
+            </w:tcBorders>
+            <w:tcMar>
+              <w:top w:type="dxa" w:w="40"/>
+              <w:left w:type="dxa" w:w="80"/>
+              <w:bottom w:type="dxa" w:w="40"/>
+              <w:right w:type="dxa" w:w="80"/>
+            </w:tcMar>
+          </w:tcPr>
+          <w:p>
+            <w:r>
+              <w:rPr>
+                <w:sz w:val="17"/>
+                <w:szCs w:val="17"/>
+              </w:rPr>
+              <w:t xml:space="preserve">−1,544 ha/yr</w:t>
+            </w:r>
+          </w:p>
+        </w:tc>
+        <w:tc>
+          <w:tcPr>
+            <w:tcW w:type="dxa" w:w="2409"/>
+            <w:tcBorders>
+              <w:top w:val="single" w:color="C4C0B6" w:sz="4"/>
+              <w:left w:val="single" w:color="C4C0B6" w:sz="4"/>
+              <w:bottom w:val="single" w:color="C4C0B6" w:sz="4"/>
+              <w:right w:val="single" w:color="C4C0B6" w:sz="4"/>
+            </w:tcBorders>
+            <w:tcMar>
+              <w:top w:type="dxa" w:w="40"/>
+              <w:left w:type="dxa" w:w="80"/>
+              <w:bottom w:type="dxa" w:w="40"/>
+              <w:right w:type="dxa" w:w="80"/>
+            </w:tcMar>
+          </w:tcPr>
+          <w:p>
+            <w:r>
+              <w:rPr>
+                <w:sz w:val="17"/>
+                <w:szCs w:val="17"/>
+              </w:rPr>
+              <w:t xml:space="preserve">holds up, in hectares only</w:t>
+            </w:r>
+          </w:p>
+        </w:tc>
+      </w:tr>
+      <w:tr>
+        <w:tc>
+          <w:tcPr>
+            <w:tcW w:type="dxa" w:w="2409"/>
+            <w:tcBorders>
+              <w:top w:val="single" w:color="C4C0B6" w:sz="4"/>
+              <w:left w:val="single" w:color="C4C0B6" w:sz="4"/>
+              <w:bottom w:val="single" w:color="C4C0B6" w:sz="4"/>
+              <w:right w:val="single" w:color="C4C0B6" w:sz="4"/>
+            </w:tcBorders>
+            <w:tcMar>
+              <w:top w:type="dxa" w:w="40"/>
+              <w:left w:type="dxa" w:w="80"/>
+              <w:bottom w:type="dxa" w:w="40"/>
+              <w:right w:type="dxa" w:w="80"/>
+            </w:tcMar>
+          </w:tcPr>
+          <w:p>
+            <w:r>
+              <w:rPr>
+                <w:sz w:val="17"/>
+                <w:szCs w:val="17"/>
+              </w:rPr>
+              <w:t xml:space="preserve">Synthetic control</w:t>
+            </w:r>
+          </w:p>
+        </w:tc>
+        <w:tc>
+          <w:tcPr>
+            <w:tcW w:type="dxa" w:w="2409"/>
+            <w:tcBorders>
+              <w:top w:val="single" w:color="C4C0B6" w:sz="4"/>
+              <w:left w:val="single" w:color="C4C0B6" w:sz="4"/>
+              <w:bottom w:val="single" w:color="C4C0B6" w:sz="4"/>
+              <w:right w:val="single" w:color="C4C0B6" w:sz="4"/>
+            </w:tcBorders>
+            <w:tcMar>
+              <w:top w:type="dxa" w:w="40"/>
+              <w:left w:type="dxa" w:w="80"/>
+              <w:bottom w:type="dxa" w:w="40"/>
+              <w:right w:type="dxa" w:w="80"/>
+            </w:tcMar>
+          </w:tcPr>
+          <w:p>
+            <w:r>
+              <w:rPr>
+                <w:sz w:val="17"/>
+                <w:szCs w:val="17"/>
+              </w:rPr>
+              <w:t xml:space="preserve">a weighted copy built before 2019</w:t>
+            </w:r>
+          </w:p>
+        </w:tc>
+        <w:tc>
+          <w:tcPr>
+            <w:tcW w:type="dxa" w:w="2409"/>
+            <w:tcBorders>
+              <w:top w:val="single" w:color="C4C0B6" w:sz="4"/>
+              <w:left w:val="single" w:color="C4C0B6" w:sz="4"/>
+              <w:bottom w:val="single" w:color="C4C0B6" w:sz="4"/>
+              <w:right w:val="single" w:color="C4C0B6" w:sz="4"/>
+            </w:tcBorders>
+            <w:tcMar>
+              <w:top w:type="dxa" w:w="40"/>
+              <w:left w:type="dxa" w:w="80"/>
+              <w:bottom w:type="dxa" w:w="40"/>
+              <w:right w:type="dxa" w:w="80"/>
+            </w:tcMar>
+          </w:tcPr>
+          <w:p>
+            <w:r>
+              <w:rPr>
+                <w:sz w:val="17"/>
+                <w:szCs w:val="17"/>
+              </w:rPr>
+              <w:t xml:space="preserve">−411 ha/yr</w:t>
+            </w:r>
+          </w:p>
+        </w:tc>
+        <w:tc>
+          <w:tcPr>
+            <w:tcW w:type="dxa" w:w="2409"/>
+            <w:tcBorders>
+              <w:top w:val="single" w:color="C4C0B6" w:sz="4"/>
+              <w:left w:val="single" w:color="C4C0B6" w:sz="4"/>
+              <w:bottom w:val="single" w:color="C4C0B6" w:sz="4"/>
+              <w:right w:val="single" w:color="C4C0B6" w:sz="4"/>
+            </w:tcBorders>
+            <w:tcMar>
+              <w:top w:type="dxa" w:w="40"/>
+              <w:left w:type="dxa" w:w="80"/>
+              <w:bottom w:type="dxa" w:w="40"/>
+              <w:right w:type="dxa" w:w="80"/>
+            </w:tcMar>
+          </w:tcPr>
+          <w:p>
+            <w:r>
+              <w:rPr>
+                <w:sz w:val="17"/>
+                <w:szCs w:val="17"/>
+              </w:rPr>
+              <w:t xml:space="preserve">no good copy before 2019</w:t>
+            </w:r>
+          </w:p>
+        </w:tc>
+      </w:tr>
+      <w:tr>
+        <w:tc>
+          <w:tcPr>
+            <w:tcW w:type="dxa" w:w="2409"/>
+            <w:tcBorders>
+              <w:top w:val="single" w:color="C4C0B6" w:sz="4"/>
+              <w:left w:val="single" w:color="C4C0B6" w:sz="4"/>
+              <w:bottom w:val="single" w:color="C4C0B6" w:sz="4"/>
+              <w:right w:val="single" w:color="C4C0B6" w:sz="4"/>
+            </w:tcBorders>
+            <w:tcMar>
+              <w:top w:type="dxa" w:w="40"/>
+              <w:left w:type="dxa" w:w="80"/>
+              <w:bottom w:type="dxa" w:w="40"/>
+              <w:right w:type="dxa" w:w="80"/>
+            </w:tcMar>
+          </w:tcPr>
+          <w:p>
+            <w:r>
+              <w:rPr>
+                <w:sz w:val="17"/>
+                <w:szCs w:val="17"/>
+              </w:rPr>
+              <w:t xml:space="preserve">Rule-based twins (AMW, another product)</w:t>
+            </w:r>
+          </w:p>
+        </w:tc>
+        <w:tc>
+          <w:tcPr>
+            <w:tcW w:type="dxa" w:w="2409"/>
+            <w:tcBorders>
+              <w:top w:val="single" w:color="C4C0B6" w:sz="4"/>
+              <w:left w:val="single" w:color="C4C0B6" w:sz="4"/>
+              <w:bottom w:val="single" w:color="C4C0B6" w:sz="4"/>
+              <w:right w:val="single" w:color="C4C0B6" w:sz="4"/>
+            </w:tcBorders>
+            <w:tcMar>
+              <w:top w:type="dxa" w:w="40"/>
+              <w:left w:type="dxa" w:w="80"/>
+              <w:bottom w:type="dxa" w:w="40"/>
+              <w:right w:type="dxa" w:w="80"/>
+            </w:tcMar>
+          </w:tcPr>
+          <w:p>
+            <w:r>
+              <w:rPr>
+                <w:sz w:val="17"/>
+                <w:szCs w:val="17"/>
+              </w:rPr>
+              <w:t xml:space="preserve">look-alike mining areas in Brazil</w:t>
+            </w:r>
+          </w:p>
+        </w:tc>
+        <w:tc>
+          <w:tcPr>
+            <w:tcW w:type="dxa" w:w="2409"/>
+            <w:tcBorders>
+              <w:top w:val="single" w:color="C4C0B6" w:sz="4"/>
+              <w:left w:val="single" w:color="C4C0B6" w:sz="4"/>
+              <w:bottom w:val="single" w:color="C4C0B6" w:sz="4"/>
+              <w:right w:val="single" w:color="C4C0B6" w:sz="4"/>
+            </w:tcBorders>
+            <w:tcMar>
+              <w:top w:type="dxa" w:w="40"/>
+              <w:left w:type="dxa" w:w="80"/>
+              <w:bottom w:type="dxa" w:w="40"/>
+              <w:right w:type="dxa" w:w="80"/>
+            </w:tcMar>
+          </w:tcPr>
+          <w:p>
+            <w:r>
+              <w:rPr>
+                <w:sz w:val="17"/>
+                <w:szCs w:val="17"/>
+              </w:rPr>
+              <w:t xml:space="preserve">Tambopata at 16%–41% of the twins' pace</w:t>
+            </w:r>
+          </w:p>
+        </w:tc>
+        <w:tc>
+          <w:tcPr>
+            <w:tcW w:type="dxa" w:w="2409"/>
+            <w:tcBorders>
+              <w:top w:val="single" w:color="C4C0B6" w:sz="4"/>
+              <w:left w:val="single" w:color="C4C0B6" w:sz="4"/>
+              <w:bottom w:val="single" w:color="C4C0B6" w:sz="4"/>
+              <w:right w:val="single" w:color="C4C0B6" w:sz="4"/>
+            </w:tcBorders>
+            <w:tcMar>
+              <w:top w:type="dxa" w:w="40"/>
+              <w:left w:type="dxa" w:w="80"/>
+              <w:bottom w:type="dxa" w:w="40"/>
+              <w:right w:type="dxa" w:w="80"/>
+            </w:tcMar>
+          </w:tcPr>
+          <w:p>
+            <w:r>
+              <w:rPr>
+                <w:sz w:val="17"/>
+                <w:szCs w:val="17"/>
+              </w:rPr>
+              <w:t xml:space="preserve">different trends before 2019</w:t>
+            </w:r>
+          </w:p>
+        </w:tc>
+      </w:tr>
+      <w:tr>
+        <w:tc>
+          <w:tcPr>
+            <w:tcW w:type="dxa" w:w="2409"/>
+            <w:tcBorders>
+              <w:top w:val="single" w:color="C4C0B6" w:sz="4"/>
+              <w:left w:val="single" w:color="C4C0B6" w:sz="4"/>
+              <w:bottom w:val="single" w:color="C4C0B6" w:sz="4"/>
+              <w:right w:val="single" w:color="C4C0B6" w:sz="4"/>
+            </w:tcBorders>
+            <w:tcMar>
+              <w:top w:type="dxa" w:w="40"/>
+              <w:left w:type="dxa" w:w="80"/>
+              <w:bottom w:type="dxa" w:w="40"/>
+              <w:right w:type="dxa" w:w="80"/>
+            </w:tcMar>
+          </w:tcPr>
+          <w:p>
+            <w:r>
+              <w:rPr>
+                <w:sz w:val="17"/>
+                <w:szCs w:val="17"/>
+              </w:rPr>
+              <w:t xml:space="preserve">Matching, 5 estimators</w:t>
+            </w:r>
+          </w:p>
+        </w:tc>
+        <w:tc>
+          <w:tcPr>
+            <w:tcW w:type="dxa" w:w="2409"/>
+            <w:tcBorders>
+              <w:top w:val="single" w:color="C4C0B6" w:sz="4"/>
+              <w:left w:val="single" w:color="C4C0B6" w:sz="4"/>
+              <w:bottom w:val="single" w:color="C4C0B6" w:sz="4"/>
+              <w:right w:val="single" w:color="C4C0B6" w:sz="4"/>
+            </w:tcBorders>
+            <w:tcMar>
+              <w:top w:type="dxa" w:w="40"/>
+              <w:left w:type="dxa" w:w="80"/>
+              <w:bottom w:type="dxa" w:w="40"/>
+              <w:right w:type="dxa" w:w="80"/>
+            </w:tcMar>
+          </w:tcPr>
+          <w:p>
+            <w:r>
+              <w:rPr>
+                <w:sz w:val="17"/>
+                <w:szCs w:val="17"/>
+              </w:rPr>
+              <w:t xml:space="preserve">areas picked by algorithm</w:t>
+            </w:r>
+          </w:p>
+        </w:tc>
+        <w:tc>
+          <w:tcPr>
+            <w:tcW w:type="dxa" w:w="2409"/>
+            <w:tcBorders>
+              <w:top w:val="single" w:color="C4C0B6" w:sz="4"/>
+              <w:left w:val="single" w:color="C4C0B6" w:sz="4"/>
+              <w:bottom w:val="single" w:color="C4C0B6" w:sz="4"/>
+              <w:right w:val="single" w:color="C4C0B6" w:sz="4"/>
+            </w:tcBorders>
+            <w:tcMar>
+              <w:top w:type="dxa" w:w="40"/>
+              <w:left w:type="dxa" w:w="80"/>
+              <w:bottom w:type="dxa" w:w="40"/>
+              <w:right w:type="dxa" w:w="80"/>
+            </w:tcMar>
+          </w:tcPr>
+          <w:p>
+            <w:r>
+              <w:rPr>
+                <w:sz w:val="17"/>
+                <w:szCs w:val="17"/>
+              </w:rPr>
+              <w:t xml:space="preserve">placebo p 0.15–0.60</w:t>
+            </w:r>
+          </w:p>
+        </w:tc>
+        <w:tc>
+          <w:tcPr>
+            <w:tcW w:type="dxa" w:w="2409"/>
+            <w:tcBorders>
+              <w:top w:val="single" w:color="C4C0B6" w:sz="4"/>
+              <w:left w:val="single" w:color="C4C0B6" w:sz="4"/>
+              <w:bottom w:val="single" w:color="C4C0B6" w:sz="4"/>
+              <w:right w:val="single" w:color="C4C0B6" w:sz="4"/>
+            </w:tcBorders>
+            <w:tcMar>
+              <w:top w:type="dxa" w:w="40"/>
+              <w:left w:type="dxa" w:w="80"/>
+              <w:bottom w:type="dxa" w:w="40"/>
+              <w:right w:type="dxa" w:w="80"/>
+            </w:tcMar>
+          </w:tcPr>
+          <w:p>
+            <w:r>
+              <w:rPr>
+                <w:sz w:val="17"/>
+                <w:szCs w:val="17"/>
+              </w:rPr>
+              <w:t xml:space="preserve">cannot beat chance</w:t>
+            </w:r>
+          </w:p>
+        </w:tc>
+      </w:tr>
+      <w:tr>
+        <w:tc>
+          <w:tcPr>
+            <w:tcW w:type="dxa" w:w="2409"/>
+            <w:tcBorders>
+              <w:top w:val="single" w:color="C4C0B6" w:sz="4"/>
+              <w:left w:val="single" w:color="C4C0B6" w:sz="4"/>
+              <w:bottom w:val="single" w:color="C4C0B6" w:sz="4"/>
+              <w:right w:val="single" w:color="C4C0B6" w:sz="4"/>
+            </w:tcBorders>
+            <w:tcMar>
+              <w:top w:type="dxa" w:w="40"/>
+              <w:left w:type="dxa" w:w="80"/>
+              <w:bottom w:type="dxa" w:w="40"/>
+              <w:right w:type="dxa" w:w="80"/>
+            </w:tcMar>
+          </w:tcPr>
+          <w:p>
+            <w:r>
+              <w:rPr>
+                <w:sz w:val="17"/>
+                <w:szCs w:val="17"/>
+              </w:rPr>
+              <w:t xml:space="preserve">Either side of the road (spatial discontinuity)</w:t>
+            </w:r>
+          </w:p>
+        </w:tc>
+        <w:tc>
+          <w:tcPr>
+            <w:tcW w:type="dxa" w:w="2409"/>
+            <w:tcBorders>
+              <w:top w:val="single" w:color="C4C0B6" w:sz="4"/>
+              <w:left w:val="single" w:color="C4C0B6" w:sz="4"/>
+              <w:bottom w:val="single" w:color="C4C0B6" w:sz="4"/>
+              <w:right w:val="single" w:color="C4C0B6" w:sz="4"/>
+            </w:tcBorders>
+            <w:tcMar>
+              <w:top w:type="dxa" w:w="40"/>
+              <w:left w:type="dxa" w:w="80"/>
+              <w:bottom w:type="dxa" w:w="40"/>
+              <w:right w:type="dxa" w:w="80"/>
+            </w:tcMar>
+          </w:tcPr>
+          <w:p>
+            <w:r>
+              <w:rPr>
+                <w:sz w:val="17"/>
+                <w:szCs w:val="17"/>
+              </w:rPr>
+              <w:t xml:space="preserve">land just north vs just south of the highway</w:t>
+            </w:r>
+          </w:p>
+        </w:tc>
+        <w:tc>
+          <w:tcPr>
+            <w:tcW w:type="dxa" w:w="2409"/>
+            <w:tcBorders>
+              <w:top w:val="single" w:color="C4C0B6" w:sz="4"/>
+              <w:left w:val="single" w:color="C4C0B6" w:sz="4"/>
+              <w:bottom w:val="single" w:color="C4C0B6" w:sz="4"/>
+              <w:right w:val="single" w:color="C4C0B6" w:sz="4"/>
+            </w:tcBorders>
+            <w:tcMar>
+              <w:top w:type="dxa" w:w="40"/>
+              <w:left w:type="dxa" w:w="80"/>
+              <w:bottom w:type="dxa" w:w="40"/>
+              <w:right w:type="dxa" w:w="80"/>
+            </w:tcMar>
+          </w:tcPr>
+          <w:p>
+            <w:r>
+              <w:rPr>
+                <w:sz w:val="17"/>
+                <w:szCs w:val="17"/>
+              </w:rPr>
+              <w:t xml:space="preserve">+2.2 points of land a year (p = 0.25)</w:t>
+            </w:r>
+          </w:p>
+        </w:tc>
+        <w:tc>
+          <w:tcPr>
+            <w:tcW w:type="dxa" w:w="2409"/>
+            <w:tcBorders>
+              <w:top w:val="single" w:color="C4C0B6" w:sz="4"/>
+              <w:left w:val="single" w:color="C4C0B6" w:sz="4"/>
+              <w:bottom w:val="single" w:color="C4C0B6" w:sz="4"/>
+              <w:right w:val="single" w:color="C4C0B6" w:sz="4"/>
+            </w:tcBorders>
+            <w:tcMar>
+              <w:top w:type="dxa" w:w="40"/>
+              <w:left w:type="dxa" w:w="80"/>
+              <w:bottom w:type="dxa" w:w="40"/>
+              <w:right w:type="dxa" w:w="80"/>
+            </w:tcMar>
+          </w:tcPr>
+          <w:p>
+            <w:r>
+              <w:rPr>
+                <w:sz w:val="17"/>
+                <w:szCs w:val="17"/>
+              </w:rPr>
+              <w:t xml:space="preserve">too noisy to tell</w:t>
+            </w:r>
+          </w:p>
+        </w:tc>
+      </w:tr>
+    </w:tbl>
+    <w:p>
+      <w:pPr>
+        <w:spacing w:after="80"/>
+      </w:pPr>
+    </w:p>
+    <w:p>
+      <w:pPr>
+        <w:pStyle w:val="Heading1"/>
+      </w:pPr>
+      <w:r>
+        <w:t xml:space="preserve">Appendix D. Online material and files</w:t>
+      </w:r>
+    </w:p>
+    <w:p>
+      <w:pPr>
+        <w:pStyle w:val="ListParagraph"/>
+        <w:numPr>
+          <w:ilvl w:val="0"/>
+          <w:numId w:val="2"/>
+        </w:numPr>
+        <w:spacing w:after="40"/>
+      </w:pPr>
+      <w:r>
+        <w:rPr>
+          <w:b/>
+          <w:bCs/>
+        </w:rPr>
+        <w:t xml:space="preserve">Walkthrough</w:t>
+      </w:r>
+      <w:r>
+        <w:t xml:space="preserve"> (every analysis and figure, in the order of this brief): </w:t>
+      </w:r>
+      <w:hyperlink w:history="1" r:id="rIdcfxyybq6tgh8t4u3qk7ra">
+        <w:r>
+          <w:rPr>
+            <w:rStyle w:val="Hyperlink"/>
+          </w:rPr>
+          <w:t xml:space="preserve">https://claude.ai/artifact/VT9wkZqxhH8WAHU4v36mg6</w:t>
+        </w:r>
+      </w:hyperlink>
+    </w:p>
+    <w:p>
+      <w:pPr>
+        <w:pStyle w:val="ListParagraph"/>
+        <w:numPr>
+          <w:ilvl w:val="0"/>
+          <w:numId w:val="2"/>
+        </w:numPr>
+        <w:spacing w:after="40"/>
+      </w:pPr>
+      <w:r>
+        <w:rPr>
+          <w:b/>
+          <w:bCs/>
+        </w:rPr>
+        <w:t xml:space="preserve">Methods page</w:t>
+      </w:r>
+      <w:r>
+        <w:t xml:space="preserve"> (each method: question, how it works, limits, code): </w:t>
+      </w:r>
+      <w:hyperlink w:history="1" r:id="rIdeyzhsyijrvzklranfjxh_">
+        <w:r>
+          <w:rPr>
+            <w:rStyle w:val="Hyperlink"/>
+          </w:rPr>
+          <w:t xml:space="preserve">https://claude.ai/artifact/83ZeCu4frkocBDJ46RV1pA</w:t>
+        </w:r>
+      </w:hyperlink>
+    </w:p>
+    <w:p>
+      <w:pPr>
+        <w:pStyle w:val="ListParagraph"/>
+        <w:numPr>
+          <w:ilvl w:val="0"/>
+          <w:numId w:val="2"/>
+        </w:numPr>
+        <w:spacing w:after="40"/>
+      </w:pPr>
+      <w:r>
+        <w:rPr>
+          <w:b/>
+          <w:bCs/>
+        </w:rPr>
+        <w:t xml:space="preserve">This brief online:</w:t>
+      </w:r>
+      <w:r>
+        <w:t xml:space="preserve"> </w:t>
+      </w:r>
+      <w:hyperlink w:history="1" r:id="rIdcq0j9s5ar7ucdpc3oj3ri">
+        <w:r>
+          <w:rPr>
+            <w:rStyle w:val="Hyperlink"/>
+          </w:rPr>
+          <w:t xml:space="preserve">https://claude.ai/artifact/NRjV7R75F8Wvogn6Bs3ycJ</w:t>
+        </w:r>
+      </w:hyperlink>
+    </w:p>
+    <w:p>
+      <w:pPr>
+        <w:pStyle w:val="ListParagraph"/>
+        <w:numPr>
+          <w:ilvl w:val="0"/>
+          <w:numId w:val="2"/>
+        </w:numPr>
+        <w:spacing w:after="40"/>
+      </w:pPr>
+      <w:r>
+        <w:t xml:space="preserve">Offline copies of all three pages are in </w:t>
+      </w:r>
+      <w:r>
+        <w:rPr>
+          <w:rFonts w:ascii="Consolas" w:cs="Consolas" w:eastAsia="Consolas" w:hAnsi="Consolas"/>
+          <w:sz w:val="18"/>
+          <w:szCs w:val="18"/>
+        </w:rPr>
+        <w:t xml:space="preserve">deliverables/pages/</w:t>
+      </w:r>
+      <w:r>
+        <w:t xml:space="preserve"> and in the replication zip (</w:t>
+      </w:r>
+      <w:r>
+        <w:rPr>
+          <w:rFonts w:ascii="Consolas" w:cs="Consolas" w:eastAsia="Consolas" w:hAnsi="Consolas"/>
+          <w:sz w:val="18"/>
+          <w:szCs w:val="18"/>
+        </w:rPr>
+        <w:t xml:space="preserve">docs/walkthrough/EXPLAINER.html</w:t>
+      </w:r>
+      <w:r>
+        <w:t xml:space="preserve">, </w:t>
+      </w:r>
+      <w:r>
+        <w:rPr>
+          <w:rFonts w:ascii="Consolas" w:cs="Consolas" w:eastAsia="Consolas" w:hAnsi="Consolas"/>
+          <w:sz w:val="18"/>
+          <w:szCs w:val="18"/>
+        </w:rPr>
+        <w:t xml:space="preserve">METHODS.html</w:t>
+      </w:r>
+      <w:r>
+        <w:t xml:space="preserve">, </w:t>
+      </w:r>
+      <w:r>
+        <w:rPr>
+          <w:rFonts w:ascii="Consolas" w:cs="Consolas" w:eastAsia="Consolas" w:hAnsi="Consolas"/>
+          <w:sz w:val="18"/>
+          <w:szCs w:val="18"/>
+        </w:rPr>
+        <w:t xml:space="preserve">docs/brief/BRIEF.html</w:t>
+      </w:r>
+      <w:r>
+        <w:t xml:space="preserve">).</w:t>
       </w:r>
     </w:p>
     <w:p>

</xml_diff>

<commit_message>
Cover photo (AFP, credited), chapter numbers in slide headings, appendix on its own page, offline pages in the replication zip, clean all-materials zip
Co-Authored-By: Claude Opus 5.5 (1M context) <noreply@anthropic.com>
</commit_message>
<xml_diff>
--- a/deliverables/GroupAnteater_Q2_brief.docx
+++ b/deliverables/GroupAnteater_Q2_brief.docx
@@ -1685,7 +1685,7 @@
       <w:r>
         <w:t xml:space="preserve">, 12, 094004. </w:t>
       </w:r>
-      <w:hyperlink w:history="1" r:id="rId5a-a5ol_swlipa8uq6mbg">
+      <w:hyperlink w:history="1" r:id="rIdvverzv_stve-abkv0pee1">
         <w:r>
           <w:rPr>
             <w:rStyle w:val="Hyperlink"/>
@@ -1719,7 +1719,7 @@
       <w:r>
         <w:t xml:space="preserve">, 93(1), 113–125. </w:t>
       </w:r>
-      <w:hyperlink w:history="1" r:id="rIdnwl-ssznujrxfxhybcevt">
+      <w:hyperlink w:history="1" r:id="rId9br_mjyqln6jlk2lcaaqu">
         <w:r>
           <w:rPr>
             <w:rStyle w:val="Hyperlink"/>
@@ -1753,7 +1753,7 @@
       <w:r>
         <w:t xml:space="preserve">, 16(5), e12978. </w:t>
       </w:r>
-      <w:hyperlink w:history="1" r:id="rIdfthncjfrmduzwk0toeoqd">
+      <w:hyperlink w:history="1" r:id="rId7yb3tdhb-lpyw0ife3a-u">
         <w:r>
           <w:rPr>
             <w:rStyle w:val="Hyperlink"/>
@@ -1777,7 +1777,7 @@
       <w:r>
         <w:t xml:space="preserve">Earth Genome (2026). Amazon Mining Watch, mining detections, model 48px_v4.10b (updated 3 Oct 2026). </w:t>
       </w:r>
-      <w:hyperlink w:history="1" r:id="rIddx7ffqxkb5cpfsxmko_-c">
+      <w:hyperlink w:history="1" r:id="rIdb9q1p6vvkiaubjulics_h">
         <w:r>
           <w:rPr>
             <w:rStyle w:val="Hyperlink"/>
@@ -1801,7 +1801,7 @@
       <w:r>
         <w:t xml:space="preserve">Finer, M., &amp; Mamani, N. (2020, 1 Dec). Illegal gold mining down 78% in Peruvian Amazon, but still threatens key areas. MAAP #130, figures "La Pampa" and "Before and after". </w:t>
       </w:r>
-      <w:hyperlink w:history="1" r:id="rIddm8n0uardvveq2ipw-fui">
+      <w:hyperlink w:history="1" r:id="rIddgdph_2mca0ccozvi0fnv">
         <w:r>
           <w:rPr>
             <w:rStyle w:val="Hyperlink"/>
@@ -1825,7 +1825,7 @@
       <w:r>
         <w:t xml:space="preserve">Frankfurt Zoological Society (n.d.). Bahuaja-Sonene and Tambopata. </w:t>
       </w:r>
-      <w:hyperlink w:history="1" r:id="rIde25dchnfsxxmp6owybm4m">
+      <w:hyperlink w:history="1" r:id="rIdhloiuyphalhuez2453qiw">
         <w:r>
           <w:rPr>
             <w:rStyle w:val="Hyperlink"/>
@@ -1849,7 +1849,7 @@
       <w:r>
         <w:t xml:space="preserve">MapBiomas Amazonía (2024). Colección 6.0 de mapas anuales de cobertura y uso del suelo en la Amazonía, 1985–2023; factsheet p. 3. </w:t>
       </w:r>
-      <w:hyperlink w:history="1" r:id="rIdzyrxrnlyllgnthqr2dzuk">
+      <w:hyperlink w:history="1" r:id="rIdu5tdapaknq9utokkamcuj">
         <w:r>
           <w:rPr>
             <w:rStyle w:val="Hyperlink"/>
@@ -1873,7 +1873,7 @@
       <w:r>
         <w:t xml:space="preserve">MapBiomas Brasil (2025). Collection 11 (mining) and Collection 10.1 (indigenous-territory statistics). </w:t>
       </w:r>
-      <w:hyperlink w:history="1" r:id="rIdbhzufwbdlahp9g8qqdy1g">
+      <w:hyperlink w:history="1" r:id="rIdjq1clpdh83b9k4f5kpldz">
         <w:r>
           <w:rPr>
             <w:rStyle w:val="Hyperlink"/>
@@ -1897,7 +1897,7 @@
       <w:r>
         <w:t xml:space="preserve">MapBiomas Peru (2025). Collection 4 of annual land cover maps of Peru: annual maps and buffer-zone, protected-area and department statistics. </w:t>
       </w:r>
-      <w:hyperlink w:history="1" r:id="rIdbi8_r1xvji_u6-bm3ohy4">
+      <w:hyperlink w:history="1" r:id="rIdhc4jnya0kjp4dgjvcfveo">
         <w:r>
           <w:rPr>
             <w:rStyle w:val="Hyperlink"/>
@@ -1921,7 +1921,7 @@
       <w:r>
         <w:t xml:space="preserve">MEF (2026). Consulta Amigable, programa presupuestal 0128, Madre de Dios. </w:t>
       </w:r>
-      <w:hyperlink w:history="1" r:id="rIdfrwgx99w3y8ezzcmx9o-h">
+      <w:hyperlink w:history="1" r:id="rIdgcsmyhpyhlyg4kqutkmx2">
         <w:r>
           <w:rPr>
             <w:rStyle w:val="Hyperlink"/>
@@ -1945,7 +1945,7 @@
       <w:r>
         <w:t xml:space="preserve">MINAM (2021). Plan Restauración: Plan integral frente a la minería ilegal (Anexo, D.S. N° 017-2021-MINAM), pp. 33, 55–56. </w:t>
       </w:r>
-      <w:hyperlink w:history="1" r:id="rIdswtlpf7hjeudzxw9wjgya">
+      <w:hyperlink w:history="1" r:id="rIdswld96fg_zlv-arc7hwk0">
         <w:r>
           <w:rPr>
             <w:rStyle w:val="Hyperlink"/>
@@ -1969,7 +1969,7 @@
       <w:r>
         <w:t xml:space="preserve">MINEM (2026). Estadísticas mineras: producción minera; and BCRP (2026), Madre de Dios gold production series. </w:t>
       </w:r>
-      <w:hyperlink w:history="1" r:id="rIdjmt73reageyds765cq_br">
+      <w:hyperlink w:history="1" r:id="rIdryw4plmzycm-ood6u6iul">
         <w:r>
           <w:rPr>
             <w:rStyle w:val="Hyperlink"/>
@@ -1980,7 +1980,7 @@
       <w:r>
         <w:t xml:space="preserve"> ; </w:t>
       </w:r>
-      <w:hyperlink w:history="1" r:id="rIdtafbno7ihkmccsmvs4ip1">
+      <w:hyperlink w:history="1" r:id="rId54cvrcsazxwi5tpb4vwmq">
         <w:r>
           <w:rPr>
             <w:rStyle w:val="Hyperlink"/>
@@ -2004,7 +2004,7 @@
       <w:r>
         <w:t xml:space="preserve">Pacsi, R., Novoa, S., La Torre, S., Balbuena, H., Finer, M., Santana, A., &amp; Castillo, H. (2026, 10 May). Rapid expansion of illegal gold mining in Tambopata National Reserve. MAAP #241, Image 1. </w:t>
       </w:r>
-      <w:hyperlink w:history="1" r:id="rId-3mlvt4px8co5zwt1af_p">
+      <w:hyperlink w:history="1" r:id="rIdh0k2y1izp7qxw79ispimg">
         <w:r>
           <w:rPr>
             <w:rStyle w:val="Hyperlink"/>
@@ -2028,7 +2028,7 @@
       <w:r>
         <w:t xml:space="preserve">Peru (2004). Ley N° 28258, Ley de Regalía Minera, Art. 5 and Art. 10. </w:t>
       </w:r>
-      <w:hyperlink w:history="1" r:id="rIdgplexefb0er4y6ywvli2i">
+      <w:hyperlink w:history="1" r:id="rIdf_vdywojojamuqabgkltk">
         <w:r>
           <w:rPr>
             <w:rStyle w:val="Hyperlink"/>
@@ -2052,7 +2052,7 @@
       <w:r>
         <w:t xml:space="preserve">University of Maryland GLAD (2026). GLAD-L Landsat forest-loss alerts, 2017–2026. </w:t>
       </w:r>
-      <w:hyperlink w:history="1" r:id="rIdugvwb6dx3q-t5d8akxymi">
+      <w:hyperlink w:history="1" r:id="rIdzpy5paxei_vztdvd4c6tq">
         <w:r>
           <w:rPr>
             <w:rStyle w:val="Hyperlink"/>
@@ -2076,7 +2076,7 @@
       <w:r>
         <w:t xml:space="preserve">World Bank (2026). Commodity price data (Pink Sheet), monthly, gold. </w:t>
       </w:r>
-      <w:hyperlink w:history="1" r:id="rIdfxftls_sehlmvs0eyb9od">
+      <w:hyperlink w:history="1" r:id="rIdisqpk985usvmkt8idcgzi">
         <w:r>
           <w:rPr>
             <w:rStyle w:val="Hyperlink"/>
@@ -2100,7 +2100,7 @@
       <w:r>
         <w:t xml:space="preserve">Yupanqui, O., Quispe, M., Novoa, S., Castañeda, C., Escalante, E., Finer, M., &amp; Mamani, N. (2023, 28 Sep). El retorno de minería ilegal en La Pampa. MAAP #193, dredge counts. </w:t>
       </w:r>
-      <w:hyperlink w:history="1" r:id="rIdzejswpdnvb2tm5uojgcd3">
+      <w:hyperlink w:history="1" r:id="rIdba3wsgpsyj2aji11ajtyh">
         <w:r>
           <w:rPr>
             <w:rStyle w:val="Hyperlink"/>
@@ -2118,6 +2118,11 @@
       </w:pPr>
       <w:r>
         <w:t xml:space="preserve">AI is not a source: no fact above is cited to an AI tool.</w:t>
+      </w:r>
+    </w:p>
+    <w:p>
+      <w:r>
+        <w:br w:type="page"/>
       </w:r>
     </w:p>
     <w:p>
@@ -3863,7 +3868,7 @@
       <w:r>
         <w:t xml:space="preserve"> (every analysis and figure, in the order of this brief): </w:t>
       </w:r>
-      <w:hyperlink w:history="1" r:id="rIdcfxyybq6tgh8t4u3qk7ra">
+      <w:hyperlink w:history="1" r:id="rIdibtmyepqzqkrvr0pix3co">
         <w:r>
           <w:rPr>
             <w:rStyle w:val="Hyperlink"/>
@@ -3891,7 +3896,7 @@
       <w:r>
         <w:t xml:space="preserve"> (each method: question, how it works, limits, code): </w:t>
       </w:r>
-      <w:hyperlink w:history="1" r:id="rIdeyzhsyijrvzklranfjxh_">
+      <w:hyperlink w:history="1" r:id="rId78cnftubmghrcezonhu5d">
         <w:r>
           <w:rPr>
             <w:rStyle w:val="Hyperlink"/>
@@ -3919,7 +3924,7 @@
       <w:r>
         <w:t xml:space="preserve"> </w:t>
       </w:r>
-      <w:hyperlink w:history="1" r:id="rIdcq0j9s5ar7ucdpc3oj3ri">
+      <w:hyperlink w:history="1" r:id="rId23nq-2jlpqn9imotsgugo">
         <w:r>
           <w:rPr>
             <w:rStyle w:val="Hyperlink"/>
@@ -3938,7 +3943,7 @@
         <w:spacing w:after="40"/>
       </w:pPr>
       <w:r>
-        <w:t xml:space="preserve">Offline copies of all three pages are in </w:t>
+        <w:t xml:space="preserve">Offline copies of all three pages are in the replication zip, folder </w:t>
       </w:r>
       <w:r>
         <w:rPr>
@@ -3946,10 +3951,10 @@
           <w:sz w:val="18"/>
           <w:szCs w:val="18"/>
         </w:rPr>
-        <w:t xml:space="preserve">deliverables/pages/</w:t>
-      </w:r>
-      <w:r>
-        <w:t xml:space="preserve"> and in the replication zip (</w:t>
+        <w:t xml:space="preserve">pages/</w:t>
+      </w:r>
+      <w:r>
+        <w:t xml:space="preserve"> (start with </w:t>
       </w:r>
       <w:r>
         <w:rPr>
@@ -3957,29 +3962,7 @@
           <w:sz w:val="18"/>
           <w:szCs w:val="18"/>
         </w:rPr>
-        <w:t xml:space="preserve">docs/walkthrough/EXPLAINER.html</w:t>
-      </w:r>
-      <w:r>
-        <w:t xml:space="preserve">, </w:t>
-      </w:r>
-      <w:r>
-        <w:rPr>
-          <w:rFonts w:ascii="Consolas" w:cs="Consolas" w:eastAsia="Consolas" w:hAnsi="Consolas"/>
-          <w:sz w:val="18"/>
-          <w:szCs w:val="18"/>
-        </w:rPr>
-        <w:t xml:space="preserve">METHODS.html</w:t>
-      </w:r>
-      <w:r>
-        <w:t xml:space="preserve">, </w:t>
-      </w:r>
-      <w:r>
-        <w:rPr>
-          <w:rFonts w:ascii="Consolas" w:cs="Consolas" w:eastAsia="Consolas" w:hAnsi="Consolas"/>
-          <w:sz w:val="18"/>
-          <w:szCs w:val="18"/>
-        </w:rPr>
-        <w:t xml:space="preserve">docs/brief/BRIEF.html</w:t>
+        <w:t xml:space="preserve">pages/index.html</w:t>
       </w:r>
       <w:r>
         <w:t xml:space="preserve">).</w:t>

</xml_diff>